<commit_message>
[2026-08-06] 日常 - 更新AI建设方案：Qwen3.5/3.6 + 华为昇腾910B/910C
</commit_message>
<xml_diff>
--- a/日常/2026-08-06/天策策略自动化配置AI基础建设方案.docx
+++ b/日常/2026-08-06/天策策略自动化配置AI基础建设方案.docx
@@ -450,7 +450,7 @@
               <w:rPr>
                 <w:rFonts w:ascii="Arial" w:eastAsia="Microsoft YaHei"/>
               </w:rPr>
-              <w:t xml:space="preserve">离线部署的大语言模型，支持中文理解、代码生成、工具调用</w:t>
+              <w:t xml:space="preserve">离线部署的大语言模型（Qwen3.5/3.6），支持中文理解、代码生成、工具调用</w:t>
             </w:r>
           </w:p>
         </w:tc>
@@ -477,7 +477,7 @@
               <w:rPr>
                 <w:rFonts w:ascii="Arial" w:eastAsia="Microsoft YaHei"/>
               </w:rPr>
-              <w:t xml:space="preserve">GPU 算力</w:t>
+              <w:t xml:space="preserve">GPU/NPU 算力</w:t>
             </w:r>
           </w:p>
         </w:tc>
@@ -527,7 +527,7 @@
               <w:rPr>
                 <w:rFonts w:ascii="Arial" w:eastAsia="Microsoft YaHei"/>
               </w:rPr>
-              <w:t xml:space="preserve">至少 1 台 GPU 服务器</w:t>
+              <w:t xml:space="preserve">至少 1 台昇腾 NPU 服务器（910B/910C）</w:t>
             </w:r>
           </w:p>
         </w:tc>
@@ -996,7 +996,7 @@
           <w:sz w:val="20"/>
           <w:szCs w:val="20"/>
         </w:rPr>
-        <w:t xml:space="preserve">│  vLLM / SGLang 推理引擎 → OpenAI 兼容 API               │</w:t>
+        <w:t xml:space="preserve">│  vLLM Ascend 推理引擎 → OpenAI 兼容 API                 │</w:t>
       </w:r>
     </w:p>
     <w:p>
@@ -1009,7 +1009,7 @@
           <w:sz w:val="20"/>
           <w:szCs w:val="20"/>
         </w:rPr>
-        <w:t xml:space="preserve">├─────────────────────────────────────────────────────────┤</w:t>
+        <w:t xml:space="preserve">│  模型：Qwen3.6-35B-A3B / Qwen3.5-27B / 122B-A10B      │</w:t>
       </w:r>
     </w:p>
     <w:p>
@@ -1022,7 +1022,7 @@
           <w:sz w:val="20"/>
           <w:szCs w:val="20"/>
         </w:rPr>
-        <w:t xml:space="preserve">│                   算力层                                 │</w:t>
+        <w:t xml:space="preserve">├─────────────────────────────────────────────────────────┤</w:t>
       </w:r>
     </w:p>
     <w:p>
@@ -1035,7 +1035,7 @@
           <w:sz w:val="20"/>
           <w:szCs w:val="20"/>
         </w:rPr>
-        <w:t xml:space="preserve">│  GPU 服务器 + CPU 服务器 + 存储                          │</w:t>
+        <w:t xml:space="preserve">│                   算力层                                 │</w:t>
       </w:r>
     </w:p>
     <w:p>
@@ -1048,6 +1048,19 @@
           <w:sz w:val="20"/>
           <w:szCs w:val="20"/>
         </w:rPr>
+        <w:t xml:space="preserve">│  华为昇腾 910B/910C NPU + CANN 驱动 + Atlas 服务器      │</w:t>
+      </w:r>
+    </w:p>
+    <w:p>
+      <w:pPr>
+        <w:shd w:fill="F2F2F2" w:val="clear"/>
+      </w:pPr>
+      <w:r>
+        <w:rPr>
+          <w:rFonts w:ascii="Consolas" w:cs="Consolas" w:eastAsia="Consolas" w:hAnsi="Consolas"/>
+          <w:sz w:val="20"/>
+          <w:szCs w:val="20"/>
+        </w:rPr>
         <w:t xml:space="preserve">└─────────────────────────────────────────────────────────┘</w:t>
       </w:r>
     </w:p>
@@ -1082,7 +1095,7 @@
         <w:rPr>
           <w:rFonts w:ascii="Arial" w:eastAsia="Microsoft YaHei"/>
         </w:rPr>
-        <w:t xml:space="preserve">策略配置场景的 LLM 负载特征为：长上下文（元数据 JSON 通常 50-200KB）、结构化输出（代码生成、JSON 构造）、中文理解（规则描述、字段映射）。综合考虑性能和成本，推荐以下两种配置方案：</w:t>
+        <w:t xml:space="preserve">策略配置场景的 LLM 负载特征为：长上下文（元数据 JSON 通常 50-200KB）、结构化输出（代码生成、JSON 构造）、中文理解（规则描述、字段映射）。在当前国际芯片出口管制背景下，华为昇腾系列 NPU 是国内企业离线部署 AI 模型的首选算力方案，供货稳定、生态成熟、不受出口限制。</w:t>
       </w:r>
     </w:p>
     <w:p>
@@ -1096,7 +1109,616 @@
           <w:b/>
           <w:bCs/>
         </w:rPr>
-        <w:t xml:space="preserve">推荐方案（14B 模型）</w:t>
+        <w:t xml:space="preserve">华为昇腾 NPU 核心规格</w:t>
+      </w:r>
+      <w:r>
+        <w:rPr>
+          <w:rFonts w:ascii="Arial" w:eastAsia="Microsoft YaHei"/>
+        </w:rPr>
+        <w:t xml:space="preserve">：</w:t>
+      </w:r>
+    </w:p>
+    <w:tbl>
+      <w:tblPr>
+        <w:tblW w:type="dxa" w:w="9026"/>
+        <w:tblBorders>
+          <w:top w:val="single" w:color="auto" w:sz="4"/>
+          <w:left w:val="single" w:color="auto" w:sz="4"/>
+          <w:bottom w:val="single" w:color="auto" w:sz="4"/>
+          <w:right w:val="single" w:color="auto" w:sz="4"/>
+          <w:insideH w:val="single" w:color="auto" w:sz="4"/>
+          <w:insideV w:val="single" w:color="auto" w:sz="4"/>
+        </w:tblBorders>
+      </w:tblPr>
+      <w:tblGrid>
+        <w:gridCol w:w="1289"/>
+        <w:gridCol w:w="1289"/>
+        <w:gridCol w:w="1289"/>
+        <w:gridCol w:w="1289"/>
+        <w:gridCol w:w="1289"/>
+        <w:gridCol w:w="1289"/>
+        <w:gridCol w:w="1289"/>
+      </w:tblGrid>
+      <w:tr>
+        <w:tc>
+          <w:tcPr>
+            <w:tcW w:type="dxa" w:w="1289"/>
+            <w:tcBorders>
+              <w:top w:val="single" w:color="CCCCCC" w:sz="1"/>
+              <w:left w:val="single" w:color="CCCCCC" w:sz="1"/>
+              <w:bottom w:val="single" w:color="CCCCCC" w:sz="1"/>
+              <w:right w:val="single" w:color="CCCCCC" w:sz="1"/>
+            </w:tcBorders>
+            <w:shd w:fill="D5E8F0" w:val="clear"/>
+            <w:tcMar>
+              <w:top w:type="dxa" w:w="80"/>
+              <w:left w:type="dxa" w:w="120"/>
+              <w:bottom w:type="dxa" w:w="80"/>
+              <w:right w:type="dxa" w:w="120"/>
+            </w:tcMar>
+          </w:tcPr>
+          <w:p>
+            <w:r>
+              <w:rPr>
+                <w:rFonts w:ascii="Arial" w:eastAsia="Microsoft YaHei"/>
+              </w:rPr>
+              <w:t xml:space="preserve">型号</w:t>
+            </w:r>
+          </w:p>
+        </w:tc>
+        <w:tc>
+          <w:tcPr>
+            <w:tcW w:type="dxa" w:w="1289"/>
+            <w:tcBorders>
+              <w:top w:val="single" w:color="CCCCCC" w:sz="1"/>
+              <w:left w:val="single" w:color="CCCCCC" w:sz="1"/>
+              <w:bottom w:val="single" w:color="CCCCCC" w:sz="1"/>
+              <w:right w:val="single" w:color="CCCCCC" w:sz="1"/>
+            </w:tcBorders>
+            <w:shd w:fill="D5E8F0" w:val="clear"/>
+            <w:tcMar>
+              <w:top w:type="dxa" w:w="80"/>
+              <w:left w:type="dxa" w:w="120"/>
+              <w:bottom w:type="dxa" w:w="80"/>
+              <w:right w:type="dxa" w:w="120"/>
+            </w:tcMar>
+          </w:tcPr>
+          <w:p>
+            <w:r>
+              <w:rPr>
+                <w:rFonts w:ascii="Arial" w:eastAsia="Microsoft YaHei"/>
+              </w:rPr>
+              <w:t xml:space="preserve">FP16/BF16 算力</w:t>
+            </w:r>
+          </w:p>
+        </w:tc>
+        <w:tc>
+          <w:tcPr>
+            <w:tcW w:type="dxa" w:w="1289"/>
+            <w:tcBorders>
+              <w:top w:val="single" w:color="CCCCCC" w:sz="1"/>
+              <w:left w:val="single" w:color="CCCCCC" w:sz="1"/>
+              <w:bottom w:val="single" w:color="CCCCCC" w:sz="1"/>
+              <w:right w:val="single" w:color="CCCCCC" w:sz="1"/>
+            </w:tcBorders>
+            <w:shd w:fill="D5E8F0" w:val="clear"/>
+            <w:tcMar>
+              <w:top w:type="dxa" w:w="80"/>
+              <w:left w:type="dxa" w:w="120"/>
+              <w:bottom w:type="dxa" w:w="80"/>
+              <w:right w:type="dxa" w:w="120"/>
+            </w:tcMar>
+          </w:tcPr>
+          <w:p>
+            <w:r>
+              <w:rPr>
+                <w:rFonts w:ascii="Arial" w:eastAsia="Microsoft YaHei"/>
+              </w:rPr>
+              <w:t xml:space="preserve">显存</w:t>
+            </w:r>
+          </w:p>
+        </w:tc>
+        <w:tc>
+          <w:tcPr>
+            <w:tcW w:type="dxa" w:w="1289"/>
+            <w:tcBorders>
+              <w:top w:val="single" w:color="CCCCCC" w:sz="1"/>
+              <w:left w:val="single" w:color="CCCCCC" w:sz="1"/>
+              <w:bottom w:val="single" w:color="CCCCCC" w:sz="1"/>
+              <w:right w:val="single" w:color="CCCCCC" w:sz="1"/>
+            </w:tcBorders>
+            <w:shd w:fill="D5E8F0" w:val="clear"/>
+            <w:tcMar>
+              <w:top w:type="dxa" w:w="80"/>
+              <w:left w:type="dxa" w:w="120"/>
+              <w:bottom w:type="dxa" w:w="80"/>
+              <w:right w:type="dxa" w:w="120"/>
+            </w:tcMar>
+          </w:tcPr>
+          <w:p>
+            <w:r>
+              <w:rPr>
+                <w:rFonts w:ascii="Arial" w:eastAsia="Microsoft YaHei"/>
+              </w:rPr>
+              <w:t xml:space="preserve">显存带宽</w:t>
+            </w:r>
+          </w:p>
+        </w:tc>
+        <w:tc>
+          <w:tcPr>
+            <w:tcW w:type="dxa" w:w="1289"/>
+            <w:tcBorders>
+              <w:top w:val="single" w:color="CCCCCC" w:sz="1"/>
+              <w:left w:val="single" w:color="CCCCCC" w:sz="1"/>
+              <w:bottom w:val="single" w:color="CCCCCC" w:sz="1"/>
+              <w:right w:val="single" w:color="CCCCCC" w:sz="1"/>
+            </w:tcBorders>
+            <w:shd w:fill="D5E8F0" w:val="clear"/>
+            <w:tcMar>
+              <w:top w:type="dxa" w:w="80"/>
+              <w:left w:type="dxa" w:w="120"/>
+              <w:bottom w:type="dxa" w:w="80"/>
+              <w:right w:type="dxa" w:w="120"/>
+            </w:tcMar>
+          </w:tcPr>
+          <w:p>
+            <w:r>
+              <w:rPr>
+                <w:rFonts w:ascii="Arial" w:eastAsia="Microsoft YaHei"/>
+              </w:rPr>
+              <w:t xml:space="preserve">功耗</w:t>
+            </w:r>
+          </w:p>
+        </w:tc>
+        <w:tc>
+          <w:tcPr>
+            <w:tcW w:type="dxa" w:w="1289"/>
+            <w:tcBorders>
+              <w:top w:val="single" w:color="CCCCCC" w:sz="1"/>
+              <w:left w:val="single" w:color="CCCCCC" w:sz="1"/>
+              <w:bottom w:val="single" w:color="CCCCCC" w:sz="1"/>
+              <w:right w:val="single" w:color="CCCCCC" w:sz="1"/>
+            </w:tcBorders>
+            <w:shd w:fill="D5E8F0" w:val="clear"/>
+            <w:tcMar>
+              <w:top w:type="dxa" w:w="80"/>
+              <w:left w:type="dxa" w:w="120"/>
+              <w:bottom w:type="dxa" w:w="80"/>
+              <w:right w:type="dxa" w:w="120"/>
+            </w:tcMar>
+          </w:tcPr>
+          <w:p>
+            <w:r>
+              <w:rPr>
+                <w:rFonts w:ascii="Arial" w:eastAsia="Microsoft YaHei"/>
+              </w:rPr>
+              <w:t xml:space="preserve">制程</w:t>
+            </w:r>
+          </w:p>
+        </w:tc>
+        <w:tc>
+          <w:tcPr>
+            <w:tcW w:type="dxa" w:w="1289"/>
+            <w:tcBorders>
+              <w:top w:val="single" w:color="CCCCCC" w:sz="1"/>
+              <w:left w:val="single" w:color="CCCCCC" w:sz="1"/>
+              <w:bottom w:val="single" w:color="CCCCCC" w:sz="1"/>
+              <w:right w:val="single" w:color="CCCCCC" w:sz="1"/>
+            </w:tcBorders>
+            <w:shd w:fill="D5E8F0" w:val="clear"/>
+            <w:tcMar>
+              <w:top w:type="dxa" w:w="80"/>
+              <w:left w:type="dxa" w:w="120"/>
+              <w:bottom w:type="dxa" w:w="80"/>
+              <w:right w:type="dxa" w:w="120"/>
+            </w:tcMar>
+          </w:tcPr>
+          <w:p>
+            <w:r>
+              <w:rPr>
+                <w:rFonts w:ascii="Arial" w:eastAsia="Microsoft YaHei"/>
+              </w:rPr>
+              <w:t xml:space="preserve">对标 NVIDIA</w:t>
+            </w:r>
+          </w:p>
+        </w:tc>
+      </w:tr>
+      <w:tr>
+        <w:tc>
+          <w:tcPr>
+            <w:tcW w:type="dxa" w:w="1289"/>
+            <w:tcBorders>
+              <w:top w:val="single" w:color="CCCCCC" w:sz="1"/>
+              <w:left w:val="single" w:color="CCCCCC" w:sz="1"/>
+              <w:bottom w:val="single" w:color="CCCCCC" w:sz="1"/>
+              <w:right w:val="single" w:color="CCCCCC" w:sz="1"/>
+            </w:tcBorders>
+            <w:tcMar>
+              <w:top w:type="dxa" w:w="80"/>
+              <w:left w:type="dxa" w:w="120"/>
+              <w:bottom w:type="dxa" w:w="80"/>
+              <w:right w:type="dxa" w:w="120"/>
+            </w:tcMar>
+          </w:tcPr>
+          <w:p>
+            <w:r>
+              <w:rPr>
+                <w:rFonts w:ascii="Arial" w:eastAsia="Microsoft YaHei"/>
+              </w:rPr>
+              <w:t xml:space="preserve">昇腾 910B</w:t>
+            </w:r>
+          </w:p>
+        </w:tc>
+        <w:tc>
+          <w:tcPr>
+            <w:tcW w:type="dxa" w:w="1289"/>
+            <w:tcBorders>
+              <w:top w:val="single" w:color="CCCCCC" w:sz="1"/>
+              <w:left w:val="single" w:color="CCCCCC" w:sz="1"/>
+              <w:bottom w:val="single" w:color="CCCCCC" w:sz="1"/>
+              <w:right w:val="single" w:color="CCCCCC" w:sz="1"/>
+            </w:tcBorders>
+            <w:tcMar>
+              <w:top w:type="dxa" w:w="80"/>
+              <w:left w:type="dxa" w:w="120"/>
+              <w:bottom w:type="dxa" w:w="80"/>
+              <w:right w:type="dxa" w:w="120"/>
+            </w:tcMar>
+          </w:tcPr>
+          <w:p>
+            <w:r>
+              <w:rPr>
+                <w:rFonts w:ascii="Arial" w:eastAsia="Microsoft YaHei"/>
+              </w:rPr>
+              <w:t xml:space="preserve">400 TFLOPS</w:t>
+            </w:r>
+          </w:p>
+        </w:tc>
+        <w:tc>
+          <w:tcPr>
+            <w:tcW w:type="dxa" w:w="1289"/>
+            <w:tcBorders>
+              <w:top w:val="single" w:color="CCCCCC" w:sz="1"/>
+              <w:left w:val="single" w:color="CCCCCC" w:sz="1"/>
+              <w:bottom w:val="single" w:color="CCCCCC" w:sz="1"/>
+              <w:right w:val="single" w:color="CCCCCC" w:sz="1"/>
+            </w:tcBorders>
+            <w:tcMar>
+              <w:top w:type="dxa" w:w="80"/>
+              <w:left w:type="dxa" w:w="120"/>
+              <w:bottom w:type="dxa" w:w="80"/>
+              <w:right w:type="dxa" w:w="120"/>
+            </w:tcMar>
+          </w:tcPr>
+          <w:p>
+            <w:r>
+              <w:rPr>
+                <w:rFonts w:ascii="Arial" w:eastAsia="Microsoft YaHei"/>
+              </w:rPr>
+              <w:t xml:space="preserve">64GB HBM2E</w:t>
+            </w:r>
+          </w:p>
+        </w:tc>
+        <w:tc>
+          <w:tcPr>
+            <w:tcW w:type="dxa" w:w="1289"/>
+            <w:tcBorders>
+              <w:top w:val="single" w:color="CCCCCC" w:sz="1"/>
+              <w:left w:val="single" w:color="CCCCCC" w:sz="1"/>
+              <w:bottom w:val="single" w:color="CCCCCC" w:sz="1"/>
+              <w:right w:val="single" w:color="CCCCCC" w:sz="1"/>
+            </w:tcBorders>
+            <w:tcMar>
+              <w:top w:type="dxa" w:w="80"/>
+              <w:left w:type="dxa" w:w="120"/>
+              <w:bottom w:type="dxa" w:w="80"/>
+              <w:right w:type="dxa" w:w="120"/>
+            </w:tcMar>
+          </w:tcPr>
+          <w:p>
+            <w:r>
+              <w:rPr>
+                <w:rFonts w:ascii="Arial" w:eastAsia="Microsoft YaHei"/>
+              </w:rPr>
+              <w:t xml:space="preserve">约 600 GB/s</w:t>
+            </w:r>
+          </w:p>
+        </w:tc>
+        <w:tc>
+          <w:tcPr>
+            <w:tcW w:type="dxa" w:w="1289"/>
+            <w:tcBorders>
+              <w:top w:val="single" w:color="CCCCCC" w:sz="1"/>
+              <w:left w:val="single" w:color="CCCCCC" w:sz="1"/>
+              <w:bottom w:val="single" w:color="CCCCCC" w:sz="1"/>
+              <w:right w:val="single" w:color="CCCCCC" w:sz="1"/>
+            </w:tcBorders>
+            <w:tcMar>
+              <w:top w:type="dxa" w:w="80"/>
+              <w:left w:type="dxa" w:w="120"/>
+              <w:bottom w:type="dxa" w:w="80"/>
+              <w:right w:type="dxa" w:w="120"/>
+            </w:tcMar>
+          </w:tcPr>
+          <w:p>
+            <w:r>
+              <w:rPr>
+                <w:rFonts w:ascii="Arial" w:eastAsia="Microsoft YaHei"/>
+              </w:rPr>
+              <w:t xml:space="preserve">310W</w:t>
+            </w:r>
+          </w:p>
+        </w:tc>
+        <w:tc>
+          <w:tcPr>
+            <w:tcW w:type="dxa" w:w="1289"/>
+            <w:tcBorders>
+              <w:top w:val="single" w:color="CCCCCC" w:sz="1"/>
+              <w:left w:val="single" w:color="CCCCCC" w:sz="1"/>
+              <w:bottom w:val="single" w:color="CCCCCC" w:sz="1"/>
+              <w:right w:val="single" w:color="CCCCCC" w:sz="1"/>
+            </w:tcBorders>
+            <w:tcMar>
+              <w:top w:type="dxa" w:w="80"/>
+              <w:left w:type="dxa" w:w="120"/>
+              <w:bottom w:type="dxa" w:w="80"/>
+              <w:right w:type="dxa" w:w="120"/>
+            </w:tcMar>
+          </w:tcPr>
+          <w:p>
+            <w:r>
+              <w:rPr>
+                <w:rFonts w:ascii="Arial" w:eastAsia="Microsoft YaHei"/>
+              </w:rPr>
+              <w:t xml:space="preserve">中芯国际 7nm</w:t>
+            </w:r>
+          </w:p>
+        </w:tc>
+        <w:tc>
+          <w:tcPr>
+            <w:tcW w:type="dxa" w:w="1289"/>
+            <w:tcBorders>
+              <w:top w:val="single" w:color="CCCCCC" w:sz="1"/>
+              <w:left w:val="single" w:color="CCCCCC" w:sz="1"/>
+              <w:bottom w:val="single" w:color="CCCCCC" w:sz="1"/>
+              <w:right w:val="single" w:color="CCCCCC" w:sz="1"/>
+            </w:tcBorders>
+            <w:tcMar>
+              <w:top w:type="dxa" w:w="80"/>
+              <w:left w:type="dxa" w:w="120"/>
+              <w:bottom w:type="dxa" w:w="80"/>
+              <w:right w:type="dxa" w:w="120"/>
+            </w:tcMar>
+          </w:tcPr>
+          <w:p>
+            <w:r>
+              <w:rPr>
+                <w:rFonts w:ascii="Arial" w:eastAsia="Microsoft YaHei"/>
+              </w:rPr>
+              <w:t xml:space="preserve">A100 80GB</w:t>
+            </w:r>
+          </w:p>
+        </w:tc>
+      </w:tr>
+      <w:tr>
+        <w:tc>
+          <w:tcPr>
+            <w:tcW w:type="dxa" w:w="1289"/>
+            <w:tcBorders>
+              <w:top w:val="single" w:color="CCCCCC" w:sz="1"/>
+              <w:left w:val="single" w:color="CCCCCC" w:sz="1"/>
+              <w:bottom w:val="single" w:color="CCCCCC" w:sz="1"/>
+              <w:right w:val="single" w:color="CCCCCC" w:sz="1"/>
+            </w:tcBorders>
+            <w:tcMar>
+              <w:top w:type="dxa" w:w="80"/>
+              <w:left w:type="dxa" w:w="120"/>
+              <w:bottom w:type="dxa" w:w="80"/>
+              <w:right w:type="dxa" w:w="120"/>
+            </w:tcMar>
+          </w:tcPr>
+          <w:p>
+            <w:r>
+              <w:rPr>
+                <w:rFonts w:ascii="Arial" w:eastAsia="Microsoft YaHei"/>
+              </w:rPr>
+              <w:t xml:space="preserve">昇腾 910C</w:t>
+            </w:r>
+          </w:p>
+        </w:tc>
+        <w:tc>
+          <w:tcPr>
+            <w:tcW w:type="dxa" w:w="1289"/>
+            <w:tcBorders>
+              <w:top w:val="single" w:color="CCCCCC" w:sz="1"/>
+              <w:left w:val="single" w:color="CCCCCC" w:sz="1"/>
+              <w:bottom w:val="single" w:color="CCCCCC" w:sz="1"/>
+              <w:right w:val="single" w:color="CCCCCC" w:sz="1"/>
+            </w:tcBorders>
+            <w:tcMar>
+              <w:top w:type="dxa" w:w="80"/>
+              <w:left w:type="dxa" w:w="120"/>
+              <w:bottom w:type="dxa" w:w="80"/>
+              <w:right w:type="dxa" w:w="120"/>
+            </w:tcMar>
+          </w:tcPr>
+          <w:p>
+            <w:r>
+              <w:rPr>
+                <w:rFonts w:ascii="Arial" w:eastAsia="Microsoft YaHei"/>
+              </w:rPr>
+              <w:t xml:space="preserve">800 TFLOPS</w:t>
+            </w:r>
+          </w:p>
+        </w:tc>
+        <w:tc>
+          <w:tcPr>
+            <w:tcW w:type="dxa" w:w="1289"/>
+            <w:tcBorders>
+              <w:top w:val="single" w:color="CCCCCC" w:sz="1"/>
+              <w:left w:val="single" w:color="CCCCCC" w:sz="1"/>
+              <w:bottom w:val="single" w:color="CCCCCC" w:sz="1"/>
+              <w:right w:val="single" w:color="CCCCCC" w:sz="1"/>
+            </w:tcBorders>
+            <w:tcMar>
+              <w:top w:type="dxa" w:w="80"/>
+              <w:left w:type="dxa" w:w="120"/>
+              <w:bottom w:type="dxa" w:w="80"/>
+              <w:right w:type="dxa" w:w="120"/>
+            </w:tcMar>
+          </w:tcPr>
+          <w:p>
+            <w:r>
+              <w:rPr>
+                <w:rFonts w:ascii="Arial" w:eastAsia="Microsoft YaHei"/>
+              </w:rPr>
+              <w:t xml:space="preserve">128GB HBM2E</w:t>
+            </w:r>
+          </w:p>
+        </w:tc>
+        <w:tc>
+          <w:tcPr>
+            <w:tcW w:type="dxa" w:w="1289"/>
+            <w:tcBorders>
+              <w:top w:val="single" w:color="CCCCCC" w:sz="1"/>
+              <w:left w:val="single" w:color="CCCCCC" w:sz="1"/>
+              <w:bottom w:val="single" w:color="CCCCCC" w:sz="1"/>
+              <w:right w:val="single" w:color="CCCCCC" w:sz="1"/>
+            </w:tcBorders>
+            <w:tcMar>
+              <w:top w:type="dxa" w:w="80"/>
+              <w:left w:type="dxa" w:w="120"/>
+              <w:bottom w:type="dxa" w:w="80"/>
+              <w:right w:type="dxa" w:w="120"/>
+            </w:tcMar>
+          </w:tcPr>
+          <w:p>
+            <w:r>
+              <w:rPr>
+                <w:rFonts w:ascii="Arial" w:eastAsia="Microsoft YaHei"/>
+              </w:rPr>
+              <w:t xml:space="preserve">784 GB/s</w:t>
+            </w:r>
+          </w:p>
+        </w:tc>
+        <w:tc>
+          <w:tcPr>
+            <w:tcW w:type="dxa" w:w="1289"/>
+            <w:tcBorders>
+              <w:top w:val="single" w:color="CCCCCC" w:sz="1"/>
+              <w:left w:val="single" w:color="CCCCCC" w:sz="1"/>
+              <w:bottom w:val="single" w:color="CCCCCC" w:sz="1"/>
+              <w:right w:val="single" w:color="CCCCCC" w:sz="1"/>
+            </w:tcBorders>
+            <w:tcMar>
+              <w:top w:type="dxa" w:w="80"/>
+              <w:left w:type="dxa" w:w="120"/>
+              <w:bottom w:type="dxa" w:w="80"/>
+              <w:right w:type="dxa" w:w="120"/>
+            </w:tcMar>
+          </w:tcPr>
+          <w:p>
+            <w:r>
+              <w:rPr>
+                <w:rFonts w:ascii="Arial" w:eastAsia="Microsoft YaHei"/>
+              </w:rPr>
+              <w:t xml:space="preserve">310W</w:t>
+            </w:r>
+          </w:p>
+        </w:tc>
+        <w:tc>
+          <w:tcPr>
+            <w:tcW w:type="dxa" w:w="1289"/>
+            <w:tcBorders>
+              <w:top w:val="single" w:color="CCCCCC" w:sz="1"/>
+              <w:left w:val="single" w:color="CCCCCC" w:sz="1"/>
+              <w:bottom w:val="single" w:color="CCCCCC" w:sz="1"/>
+              <w:right w:val="single" w:color="CCCCCC" w:sz="1"/>
+            </w:tcBorders>
+            <w:tcMar>
+              <w:top w:type="dxa" w:w="80"/>
+              <w:left w:type="dxa" w:w="120"/>
+              <w:bottom w:type="dxa" w:w="80"/>
+              <w:right w:type="dxa" w:w="120"/>
+            </w:tcMar>
+          </w:tcPr>
+          <w:p>
+            <w:r>
+              <w:rPr>
+                <w:rFonts w:ascii="Arial" w:eastAsia="Microsoft YaHei"/>
+              </w:rPr>
+              <w:t xml:space="preserve">中芯国际 7nm</w:t>
+            </w:r>
+          </w:p>
+        </w:tc>
+        <w:tc>
+          <w:tcPr>
+            <w:tcW w:type="dxa" w:w="1289"/>
+            <w:tcBorders>
+              <w:top w:val="single" w:color="CCCCCC" w:sz="1"/>
+              <w:left w:val="single" w:color="CCCCCC" w:sz="1"/>
+              <w:bottom w:val="single" w:color="CCCCCC" w:sz="1"/>
+              <w:right w:val="single" w:color="CCCCCC" w:sz="1"/>
+            </w:tcBorders>
+            <w:tcMar>
+              <w:top w:type="dxa" w:w="80"/>
+              <w:left w:type="dxa" w:w="120"/>
+              <w:bottom w:type="dxa" w:w="80"/>
+              <w:right w:type="dxa" w:w="120"/>
+            </w:tcMar>
+          </w:tcPr>
+          <w:p>
+            <w:r>
+              <w:rPr>
+                <w:rFonts w:ascii="Arial" w:eastAsia="Microsoft YaHei"/>
+              </w:rPr>
+              <w:t xml:space="preserve">H100（约 60% 算力）</w:t>
+            </w:r>
+          </w:p>
+        </w:tc>
+      </w:tr>
+    </w:tbl>
+    <w:p>
+      <w:r>
+        <w:t xml:space="preserve"/>
+      </w:r>
+    </w:p>
+    <w:p>
+      <w:pPr>
+        <w:spacing w:after="120" w:line="360" w:lineRule="auto"/>
+        <w:ind w:firstLine="480"/>
+      </w:pPr>
+      <w:r>
+        <w:rPr>
+          <w:rFonts w:ascii="Arial" w:eastAsia="Microsoft YaHei"/>
+        </w:rPr>
+        <w:t xml:space="preserve">910C 的核心优势在于 128GB 大显存（对比 H100 的 80GB），可单卡加载更大的模型而无需张量并行，功耗仅为 H100 的 45%，能效比突出。</w:t>
+      </w:r>
+    </w:p>
+    <w:p>
+      <w:pPr>
+        <w:spacing w:after="120" w:line="360" w:lineRule="auto"/>
+        <w:ind w:firstLine="480"/>
+      </w:pPr>
+      <w:r>
+        <w:rPr>
+          <w:rFonts w:ascii="Arial" w:eastAsia="Microsoft YaHei"/>
+        </w:rPr>
+        <w:t xml:space="preserve">综合性能和成本，推荐以下两种配置方案：</w:t>
+      </w:r>
+    </w:p>
+    <w:p>
+      <w:pPr>
+        <w:spacing w:after="120" w:line="360" w:lineRule="auto"/>
+        <w:ind w:firstLine="480"/>
+      </w:pPr>
+      <w:r>
+        <w:rPr>
+          <w:rFonts w:ascii="Arial" w:eastAsia="Microsoft YaHei"/>
+          <w:b/>
+          <w:bCs/>
+        </w:rPr>
+        <w:t xml:space="preserve">推荐方案（昇腾 910B，适配 Qwen3.6-35B-A3B）</w:t>
       </w:r>
       <w:r>
         <w:rPr>
@@ -1224,57 +1846,57 @@
               <w:rPr>
                 <w:rFonts w:ascii="Arial" w:eastAsia="Microsoft YaHei"/>
               </w:rPr>
-              <w:t xml:space="preserve">GPU</w:t>
-            </w:r>
-          </w:p>
-        </w:tc>
-        <w:tc>
-          <w:tcPr>
-            <w:tcW w:type="dxa" w:w="3008"/>
-            <w:tcBorders>
-              <w:top w:val="single" w:color="CCCCCC" w:sz="1"/>
-              <w:left w:val="single" w:color="CCCCCC" w:sz="1"/>
-              <w:bottom w:val="single" w:color="CCCCCC" w:sz="1"/>
-              <w:right w:val="single" w:color="CCCCCC" w:sz="1"/>
-            </w:tcBorders>
-            <w:tcMar>
-              <w:top w:type="dxa" w:w="80"/>
-              <w:left w:type="dxa" w:w="120"/>
-              <w:bottom w:type="dxa" w:w="80"/>
-              <w:right w:type="dxa" w:w="120"/>
-            </w:tcMar>
-          </w:tcPr>
-          <w:p>
-            <w:r>
-              <w:rPr>
-                <w:rFonts w:ascii="Arial" w:eastAsia="Microsoft YaHei"/>
-              </w:rPr>
-              <w:t xml:space="preserve">NVIDIA L20 48GB 或 L40S 48GB</w:t>
-            </w:r>
-          </w:p>
-        </w:tc>
-        <w:tc>
-          <w:tcPr>
-            <w:tcW w:type="dxa" w:w="3008"/>
-            <w:tcBorders>
-              <w:top w:val="single" w:color="CCCCCC" w:sz="1"/>
-              <w:left w:val="single" w:color="CCCCCC" w:sz="1"/>
-              <w:bottom w:val="single" w:color="CCCCCC" w:sz="1"/>
-              <w:right w:val="single" w:color="CCCCCC" w:sz="1"/>
-            </w:tcBorders>
-            <w:tcMar>
-              <w:top w:type="dxa" w:w="80"/>
-              <w:left w:type="dxa" w:w="120"/>
-              <w:bottom w:type="dxa" w:w="80"/>
-              <w:right w:type="dxa" w:w="120"/>
-            </w:tcMar>
-          </w:tcPr>
-          <w:p>
-            <w:r>
-              <w:rPr>
-                <w:rFonts w:ascii="Arial" w:eastAsia="Microsoft YaHei"/>
-              </w:rPr>
-              <w:t xml:space="preserve">单卡即可运行 14B FP16 模型</w:t>
+              <w:t xml:space="preserve">NPU</w:t>
+            </w:r>
+          </w:p>
+        </w:tc>
+        <w:tc>
+          <w:tcPr>
+            <w:tcW w:type="dxa" w:w="3008"/>
+            <w:tcBorders>
+              <w:top w:val="single" w:color="CCCCCC" w:sz="1"/>
+              <w:left w:val="single" w:color="CCCCCC" w:sz="1"/>
+              <w:bottom w:val="single" w:color="CCCCCC" w:sz="1"/>
+              <w:right w:val="single" w:color="CCCCCC" w:sz="1"/>
+            </w:tcBorders>
+            <w:tcMar>
+              <w:top w:type="dxa" w:w="80"/>
+              <w:left w:type="dxa" w:w="120"/>
+              <w:bottom w:type="dxa" w:w="80"/>
+              <w:right w:type="dxa" w:w="120"/>
+            </w:tcMar>
+          </w:tcPr>
+          <w:p>
+            <w:r>
+              <w:rPr>
+                <w:rFonts w:ascii="Arial" w:eastAsia="Microsoft YaHei"/>
+              </w:rPr>
+              <w:t xml:space="preserve">1 × 昇腾 910B 64GB</w:t>
+            </w:r>
+          </w:p>
+        </w:tc>
+        <w:tc>
+          <w:tcPr>
+            <w:tcW w:type="dxa" w:w="3008"/>
+            <w:tcBorders>
+              <w:top w:val="single" w:color="CCCCCC" w:sz="1"/>
+              <w:left w:val="single" w:color="CCCCCC" w:sz="1"/>
+              <w:bottom w:val="single" w:color="CCCCCC" w:sz="1"/>
+              <w:right w:val="single" w:color="CCCCCC" w:sz="1"/>
+            </w:tcBorders>
+            <w:tcMar>
+              <w:top w:type="dxa" w:w="80"/>
+              <w:left w:type="dxa" w:w="120"/>
+              <w:bottom w:type="dxa" w:w="80"/>
+              <w:right w:type="dxa" w:w="120"/>
+            </w:tcMar>
+          </w:tcPr>
+          <w:p>
+            <w:r>
+              <w:rPr>
+                <w:rFonts w:ascii="Arial" w:eastAsia="Microsoft YaHei"/>
+              </w:rPr>
+              <w:t xml:space="preserve">单卡即可运行 35B MoE 模型（激活参数仅 3B）</w:t>
             </w:r>
           </w:p>
         </w:tc>
@@ -1326,7 +1948,7 @@
               <w:rPr>
                 <w:rFonts w:ascii="Arial" w:eastAsia="Microsoft YaHei"/>
               </w:rPr>
-              <w:t xml:space="preserve">Intel Xeon Silver 4314 或同级</w:t>
+              <w:t xml:space="preserve">鲲鹏 920 或 Intel Xeon Silver 4314</w:t>
             </w:r>
           </w:p>
         </w:tc>
@@ -1587,6 +2209,83 @@
           </w:p>
         </w:tc>
       </w:tr>
+      <w:tr>
+        <w:tc>
+          <w:tcPr>
+            <w:tcW w:type="dxa" w:w="3008"/>
+            <w:tcBorders>
+              <w:top w:val="single" w:color="CCCCCC" w:sz="1"/>
+              <w:left w:val="single" w:color="CCCCCC" w:sz="1"/>
+              <w:bottom w:val="single" w:color="CCCCCC" w:sz="1"/>
+              <w:right w:val="single" w:color="CCCCCC" w:sz="1"/>
+            </w:tcBorders>
+            <w:tcMar>
+              <w:top w:type="dxa" w:w="80"/>
+              <w:left w:type="dxa" w:w="120"/>
+              <w:bottom w:type="dxa" w:w="80"/>
+              <w:right w:type="dxa" w:w="120"/>
+            </w:tcMar>
+          </w:tcPr>
+          <w:p>
+            <w:r>
+              <w:rPr>
+                <w:rFonts w:ascii="Arial" w:eastAsia="Microsoft YaHei"/>
+              </w:rPr>
+              <w:t xml:space="preserve">服务器</w:t>
+            </w:r>
+          </w:p>
+        </w:tc>
+        <w:tc>
+          <w:tcPr>
+            <w:tcW w:type="dxa" w:w="3008"/>
+            <w:tcBorders>
+              <w:top w:val="single" w:color="CCCCCC" w:sz="1"/>
+              <w:left w:val="single" w:color="CCCCCC" w:sz="1"/>
+              <w:bottom w:val="single" w:color="CCCCCC" w:sz="1"/>
+              <w:right w:val="single" w:color="CCCCCC" w:sz="1"/>
+            </w:tcBorders>
+            <w:tcMar>
+              <w:top w:type="dxa" w:w="80"/>
+              <w:left w:type="dxa" w:w="120"/>
+              <w:bottom w:type="dxa" w:w="80"/>
+              <w:right w:type="dxa" w:w="120"/>
+            </w:tcMar>
+          </w:tcPr>
+          <w:p>
+            <w:r>
+              <w:rPr>
+                <w:rFonts w:ascii="Arial" w:eastAsia="Microsoft YaHei"/>
+              </w:rPr>
+              <w:t xml:space="preserve">华为 Atlas 800 推理服务器（A2）</w:t>
+            </w:r>
+          </w:p>
+        </w:tc>
+        <w:tc>
+          <w:tcPr>
+            <w:tcW w:type="dxa" w:w="3008"/>
+            <w:tcBorders>
+              <w:top w:val="single" w:color="CCCCCC" w:sz="1"/>
+              <w:left w:val="single" w:color="CCCCCC" w:sz="1"/>
+              <w:bottom w:val="single" w:color="CCCCCC" w:sz="1"/>
+              <w:right w:val="single" w:color="CCCCCC" w:sz="1"/>
+            </w:tcBorders>
+            <w:tcMar>
+              <w:top w:type="dxa" w:w="80"/>
+              <w:left w:type="dxa" w:w="120"/>
+              <w:bottom w:type="dxa" w:w="80"/>
+              <w:right w:type="dxa" w:w="120"/>
+            </w:tcMar>
+          </w:tcPr>
+          <w:p>
+            <w:r>
+              <w:rPr>
+                <w:rFonts w:ascii="Arial" w:eastAsia="Microsoft YaHei"/>
+              </w:rPr>
+              <w:t xml:space="preserve">可选整机采购或单卡方案</w:t>
+            </w:r>
+          </w:p>
+        </w:tc>
+      </w:tr>
     </w:tbl>
     <w:p>
       <w:r>
@@ -1604,7 +2303,7 @@
           <w:b/>
           <w:bCs/>
         </w:rPr>
-        <w:t xml:space="preserve">高配方案（32B 模型）</w:t>
+        <w:t xml:space="preserve">高配方案（昇腾 910C，适配 Qwen3.5-27B 或 122B-A10B）</w:t>
       </w:r>
       <w:r>
         <w:rPr>
@@ -1732,57 +2431,57 @@
               <w:rPr>
                 <w:rFonts w:ascii="Arial" w:eastAsia="Microsoft YaHei"/>
               </w:rPr>
-              <w:t xml:space="preserve">GPU</w:t>
-            </w:r>
-          </w:p>
-        </w:tc>
-        <w:tc>
-          <w:tcPr>
-            <w:tcW w:type="dxa" w:w="3008"/>
-            <w:tcBorders>
-              <w:top w:val="single" w:color="CCCCCC" w:sz="1"/>
-              <w:left w:val="single" w:color="CCCCCC" w:sz="1"/>
-              <w:bottom w:val="single" w:color="CCCCCC" w:sz="1"/>
-              <w:right w:val="single" w:color="CCCCCC" w:sz="1"/>
-            </w:tcBorders>
-            <w:tcMar>
-              <w:top w:type="dxa" w:w="80"/>
-              <w:left w:type="dxa" w:w="120"/>
-              <w:bottom w:type="dxa" w:w="80"/>
-              <w:right w:type="dxa" w:w="120"/>
-            </w:tcMar>
-          </w:tcPr>
-          <w:p>
-            <w:r>
-              <w:rPr>
-                <w:rFonts w:ascii="Arial" w:eastAsia="Microsoft YaHei"/>
-              </w:rPr>
-              <w:t xml:space="preserve">2 × NVIDIA L20 48GB 或 1 × A100 80GB</w:t>
-            </w:r>
-          </w:p>
-        </w:tc>
-        <w:tc>
-          <w:tcPr>
-            <w:tcW w:type="dxa" w:w="3008"/>
-            <w:tcBorders>
-              <w:top w:val="single" w:color="CCCCCC" w:sz="1"/>
-              <w:left w:val="single" w:color="CCCCCC" w:sz="1"/>
-              <w:bottom w:val="single" w:color="CCCCCC" w:sz="1"/>
-              <w:right w:val="single" w:color="CCCCCC" w:sz="1"/>
-            </w:tcBorders>
-            <w:tcMar>
-              <w:top w:type="dxa" w:w="80"/>
-              <w:left w:type="dxa" w:w="120"/>
-              <w:bottom w:type="dxa" w:w="80"/>
-              <w:right w:type="dxa" w:w="120"/>
-            </w:tcMar>
-          </w:tcPr>
-          <w:p>
-            <w:r>
-              <w:rPr>
-                <w:rFonts w:ascii="Arial" w:eastAsia="Microsoft YaHei"/>
-              </w:rPr>
-              <w:t xml:space="preserve">张量并行或单卡大模型</w:t>
+              <w:t xml:space="preserve">NPU</w:t>
+            </w:r>
+          </w:p>
+        </w:tc>
+        <w:tc>
+          <w:tcPr>
+            <w:tcW w:type="dxa" w:w="3008"/>
+            <w:tcBorders>
+              <w:top w:val="single" w:color="CCCCCC" w:sz="1"/>
+              <w:left w:val="single" w:color="CCCCCC" w:sz="1"/>
+              <w:bottom w:val="single" w:color="CCCCCC" w:sz="1"/>
+              <w:right w:val="single" w:color="CCCCCC" w:sz="1"/>
+            </w:tcBorders>
+            <w:tcMar>
+              <w:top w:type="dxa" w:w="80"/>
+              <w:left w:type="dxa" w:w="120"/>
+              <w:bottom w:type="dxa" w:w="80"/>
+              <w:right w:type="dxa" w:w="120"/>
+            </w:tcMar>
+          </w:tcPr>
+          <w:p>
+            <w:r>
+              <w:rPr>
+                <w:rFonts w:ascii="Arial" w:eastAsia="Microsoft YaHei"/>
+              </w:rPr>
+              <w:t xml:space="preserve">1-2 × 昇腾 910C 128GB</w:t>
+            </w:r>
+          </w:p>
+        </w:tc>
+        <w:tc>
+          <w:tcPr>
+            <w:tcW w:type="dxa" w:w="3008"/>
+            <w:tcBorders>
+              <w:top w:val="single" w:color="CCCCCC" w:sz="1"/>
+              <w:left w:val="single" w:color="CCCCCC" w:sz="1"/>
+              <w:bottom w:val="single" w:color="CCCCCC" w:sz="1"/>
+              <w:right w:val="single" w:color="CCCCCC" w:sz="1"/>
+            </w:tcBorders>
+            <w:tcMar>
+              <w:top w:type="dxa" w:w="80"/>
+              <w:left w:type="dxa" w:w="120"/>
+              <w:bottom w:type="dxa" w:w="80"/>
+              <w:right w:type="dxa" w:w="120"/>
+            </w:tcMar>
+          </w:tcPr>
+          <w:p>
+            <w:r>
+              <w:rPr>
+                <w:rFonts w:ascii="Arial" w:eastAsia="Microsoft YaHei"/>
+              </w:rPr>
+              <w:t xml:space="preserve">单卡运行 27B Dense，双卡运行 122B-A10B</w:t>
             </w:r>
           </w:p>
         </w:tc>
@@ -1834,7 +2533,7 @@
               <w:rPr>
                 <w:rFonts w:ascii="Arial" w:eastAsia="Microsoft YaHei"/>
               </w:rPr>
-              <w:t xml:space="preserve">Intel Xeon Gold 5318Y 或同级</w:t>
+              <w:t xml:space="preserve">鲲鹏 920 5250 或 Intel Xeon Gold 5318Y</w:t>
             </w:r>
           </w:p>
         </w:tc>
@@ -2095,6 +2794,83 @@
           </w:p>
         </w:tc>
       </w:tr>
+      <w:tr>
+        <w:tc>
+          <w:tcPr>
+            <w:tcW w:type="dxa" w:w="3008"/>
+            <w:tcBorders>
+              <w:top w:val="single" w:color="CCCCCC" w:sz="1"/>
+              <w:left w:val="single" w:color="CCCCCC" w:sz="1"/>
+              <w:bottom w:val="single" w:color="CCCCCC" w:sz="1"/>
+              <w:right w:val="single" w:color="CCCCCC" w:sz="1"/>
+            </w:tcBorders>
+            <w:tcMar>
+              <w:top w:type="dxa" w:w="80"/>
+              <w:left w:type="dxa" w:w="120"/>
+              <w:bottom w:type="dxa" w:w="80"/>
+              <w:right w:type="dxa" w:w="120"/>
+            </w:tcMar>
+          </w:tcPr>
+          <w:p>
+            <w:r>
+              <w:rPr>
+                <w:rFonts w:ascii="Arial" w:eastAsia="Microsoft YaHei"/>
+              </w:rPr>
+              <w:t xml:space="preserve">服务器</w:t>
+            </w:r>
+          </w:p>
+        </w:tc>
+        <w:tc>
+          <w:tcPr>
+            <w:tcW w:type="dxa" w:w="3008"/>
+            <w:tcBorders>
+              <w:top w:val="single" w:color="CCCCCC" w:sz="1"/>
+              <w:left w:val="single" w:color="CCCCCC" w:sz="1"/>
+              <w:bottom w:val="single" w:color="CCCCCC" w:sz="1"/>
+              <w:right w:val="single" w:color="CCCCCC" w:sz="1"/>
+            </w:tcBorders>
+            <w:tcMar>
+              <w:top w:type="dxa" w:w="80"/>
+              <w:left w:type="dxa" w:w="120"/>
+              <w:bottom w:type="dxa" w:w="80"/>
+              <w:right w:type="dxa" w:w="120"/>
+            </w:tcMar>
+          </w:tcPr>
+          <w:p>
+            <w:r>
+              <w:rPr>
+                <w:rFonts w:ascii="Arial" w:eastAsia="Microsoft YaHei"/>
+              </w:rPr>
+              <w:t xml:space="preserve">华为 Atlas 800T A2 训练/推理服务器</w:t>
+            </w:r>
+          </w:p>
+        </w:tc>
+        <w:tc>
+          <w:tcPr>
+            <w:tcW w:type="dxa" w:w="3008"/>
+            <w:tcBorders>
+              <w:top w:val="single" w:color="CCCCCC" w:sz="1"/>
+              <w:left w:val="single" w:color="CCCCCC" w:sz="1"/>
+              <w:bottom w:val="single" w:color="CCCCCC" w:sz="1"/>
+              <w:right w:val="single" w:color="CCCCCC" w:sz="1"/>
+            </w:tcBorders>
+            <w:tcMar>
+              <w:top w:type="dxa" w:w="80"/>
+              <w:left w:type="dxa" w:w="120"/>
+              <w:bottom w:type="dxa" w:w="80"/>
+              <w:right w:type="dxa" w:w="120"/>
+            </w:tcMar>
+          </w:tcPr>
+          <w:p>
+            <w:r>
+              <w:rPr>
+                <w:rFonts w:ascii="Arial" w:eastAsia="Microsoft YaHei"/>
+              </w:rPr>
+              <w:t xml:space="preserve">支持多卡互联</w:t>
+            </w:r>
+          </w:p>
+        </w:tc>
+      </w:tr>
     </w:tbl>
     <w:p>
       <w:r>
@@ -2118,7 +2894,7 @@
         <w:rPr>
           <w:rFonts w:ascii="Arial" w:eastAsia="Microsoft YaHei"/>
         </w:rPr>
-        <w:t xml:space="preserve">：NVIDIA L20/L40S 不受出口管制限制，在国内渠道可正常采购。如客户已有 GPU 服务器，可直接复用。</w:t>
+        <w:t xml:space="preserve">：如客户已有 GPU 服务器（如 NVIDIA A100/A800/L20），也可直接复用，vLLM 同时支持 NVIDIA GPU 和华为昇腾 NPU。昇腾方案的优势在于供货稳定、不受出口管制影响、与国产化生态兼容性好。</w:t>
       </w:r>
     </w:p>
     <w:p>
@@ -2189,13 +2965,13 @@
           <w:b/>
           <w:bCs/>
         </w:rPr>
-        <w:t xml:space="preserve">首选：Qwen3-14B</w:t>
-      </w:r>
-      <w:r>
-        <w:rPr>
-          <w:rFonts w:ascii="Arial" w:eastAsia="Microsoft YaHei"/>
-        </w:rPr>
-        <w:t xml:space="preserve">。Apache 2.0 开源协议，商用无限制。中文能力在同规模模型中最强，原生支持 Function Calling（Hermes 格式），混合思维模式可切换快思考/慢思考。14B 参数量在单张 L20 48GB 上以 FP16 精度即可流畅运行，上下文窗口 128K tokens，足以容纳完整的元数据和策略配置。</w:t>
+        <w:t xml:space="preserve">Qwen 模型系列概览（2026 年最新版）</w:t>
+      </w:r>
+      <w:r>
+        <w:rPr>
+          <w:rFonts w:ascii="Arial" w:eastAsia="Microsoft YaHei"/>
+        </w:rPr>
+        <w:t xml:space="preserve">：</w:t>
       </w:r>
     </w:p>
     <w:p>
@@ -2206,16 +2982,1124 @@
       <w:r>
         <w:rPr>
           <w:rFonts w:ascii="Arial" w:eastAsia="Microsoft YaHei"/>
+        </w:rPr>
+        <w:t xml:space="preserve">通义千问（Qwen）已迭代至 3.5 和 3.6 两代，相比 Qwen3 有质的飞跃。Qwen3.5 采用 Gated Delta Networks + 稀疏 MoE 混合架构，在数万亿多模态 Token 上训练，支持 201 种语言，中等尺寸模型已全面超越上代旗舰 Qwen3-235B-A22B。Qwen3.6 在此基础上进一步强化 Agent 编码和仓库级推理能力，引入思维上下文保持机制，更适合多步编排场景。</w:t>
+      </w:r>
+    </w:p>
+    <w:tbl>
+      <w:tblPr>
+        <w:tblW w:type="dxa" w:w="9026"/>
+        <w:tblBorders>
+          <w:top w:val="single" w:color="auto" w:sz="4"/>
+          <w:left w:val="single" w:color="auto" w:sz="4"/>
+          <w:bottom w:val="single" w:color="auto" w:sz="4"/>
+          <w:right w:val="single" w:color="auto" w:sz="4"/>
+          <w:insideH w:val="single" w:color="auto" w:sz="4"/>
+          <w:insideV w:val="single" w:color="auto" w:sz="4"/>
+        </w:tblBorders>
+      </w:tblPr>
+      <w:tblGrid>
+        <w:gridCol w:w="1504"/>
+        <w:gridCol w:w="1504"/>
+        <w:gridCol w:w="1504"/>
+        <w:gridCol w:w="1504"/>
+        <w:gridCol w:w="1504"/>
+        <w:gridCol w:w="1504"/>
+      </w:tblGrid>
+      <w:tr>
+        <w:tc>
+          <w:tcPr>
+            <w:tcW w:type="dxa" w:w="1504"/>
+            <w:tcBorders>
+              <w:top w:val="single" w:color="CCCCCC" w:sz="1"/>
+              <w:left w:val="single" w:color="CCCCCC" w:sz="1"/>
+              <w:bottom w:val="single" w:color="CCCCCC" w:sz="1"/>
+              <w:right w:val="single" w:color="CCCCCC" w:sz="1"/>
+            </w:tcBorders>
+            <w:shd w:fill="D5E8F0" w:val="clear"/>
+            <w:tcMar>
+              <w:top w:type="dxa" w:w="80"/>
+              <w:left w:type="dxa" w:w="120"/>
+              <w:bottom w:type="dxa" w:w="80"/>
+              <w:right w:type="dxa" w:w="120"/>
+            </w:tcMar>
+          </w:tcPr>
+          <w:p>
+            <w:r>
+              <w:rPr>
+                <w:rFonts w:ascii="Arial" w:eastAsia="Microsoft YaHei"/>
+              </w:rPr>
+              <w:t xml:space="preserve">模型</w:t>
+            </w:r>
+          </w:p>
+        </w:tc>
+        <w:tc>
+          <w:tcPr>
+            <w:tcW w:type="dxa" w:w="1504"/>
+            <w:tcBorders>
+              <w:top w:val="single" w:color="CCCCCC" w:sz="1"/>
+              <w:left w:val="single" w:color="CCCCCC" w:sz="1"/>
+              <w:bottom w:val="single" w:color="CCCCCC" w:sz="1"/>
+              <w:right w:val="single" w:color="CCCCCC" w:sz="1"/>
+            </w:tcBorders>
+            <w:shd w:fill="D5E8F0" w:val="clear"/>
+            <w:tcMar>
+              <w:top w:type="dxa" w:w="80"/>
+              <w:left w:type="dxa" w:w="120"/>
+              <w:bottom w:type="dxa" w:w="80"/>
+              <w:right w:type="dxa" w:w="120"/>
+            </w:tcMar>
+          </w:tcPr>
+          <w:p>
+            <w:r>
+              <w:rPr>
+                <w:rFonts w:ascii="Arial" w:eastAsia="Microsoft YaHei"/>
+              </w:rPr>
+              <w:t xml:space="preserve">架构</w:t>
+            </w:r>
+          </w:p>
+        </w:tc>
+        <w:tc>
+          <w:tcPr>
+            <w:tcW w:type="dxa" w:w="1504"/>
+            <w:tcBorders>
+              <w:top w:val="single" w:color="CCCCCC" w:sz="1"/>
+              <w:left w:val="single" w:color="CCCCCC" w:sz="1"/>
+              <w:bottom w:val="single" w:color="CCCCCC" w:sz="1"/>
+              <w:right w:val="single" w:color="CCCCCC" w:sz="1"/>
+            </w:tcBorders>
+            <w:shd w:fill="D5E8F0" w:val="clear"/>
+            <w:tcMar>
+              <w:top w:type="dxa" w:w="80"/>
+              <w:left w:type="dxa" w:w="120"/>
+              <w:bottom w:type="dxa" w:w="80"/>
+              <w:right w:type="dxa" w:w="120"/>
+            </w:tcMar>
+          </w:tcPr>
+          <w:p>
+            <w:r>
+              <w:rPr>
+                <w:rFonts w:ascii="Arial" w:eastAsia="Microsoft YaHei"/>
+              </w:rPr>
+              <w:t xml:space="preserve">总参数</w:t>
+            </w:r>
+          </w:p>
+        </w:tc>
+        <w:tc>
+          <w:tcPr>
+            <w:tcW w:type="dxa" w:w="1504"/>
+            <w:tcBorders>
+              <w:top w:val="single" w:color="CCCCCC" w:sz="1"/>
+              <w:left w:val="single" w:color="CCCCCC" w:sz="1"/>
+              <w:bottom w:val="single" w:color="CCCCCC" w:sz="1"/>
+              <w:right w:val="single" w:color="CCCCCC" w:sz="1"/>
+            </w:tcBorders>
+            <w:shd w:fill="D5E8F0" w:val="clear"/>
+            <w:tcMar>
+              <w:top w:type="dxa" w:w="80"/>
+              <w:left w:type="dxa" w:w="120"/>
+              <w:bottom w:type="dxa" w:w="80"/>
+              <w:right w:type="dxa" w:w="120"/>
+            </w:tcMar>
+          </w:tcPr>
+          <w:p>
+            <w:r>
+              <w:rPr>
+                <w:rFonts w:ascii="Arial" w:eastAsia="Microsoft YaHei"/>
+              </w:rPr>
+              <w:t xml:space="preserve">激活参数</w:t>
+            </w:r>
+          </w:p>
+        </w:tc>
+        <w:tc>
+          <w:tcPr>
+            <w:tcW w:type="dxa" w:w="1504"/>
+            <w:tcBorders>
+              <w:top w:val="single" w:color="CCCCCC" w:sz="1"/>
+              <w:left w:val="single" w:color="CCCCCC" w:sz="1"/>
+              <w:bottom w:val="single" w:color="CCCCCC" w:sz="1"/>
+              <w:right w:val="single" w:color="CCCCCC" w:sz="1"/>
+            </w:tcBorders>
+            <w:shd w:fill="D5E8F0" w:val="clear"/>
+            <w:tcMar>
+              <w:top w:type="dxa" w:w="80"/>
+              <w:left w:type="dxa" w:w="120"/>
+              <w:bottom w:type="dxa" w:w="80"/>
+              <w:right w:type="dxa" w:w="120"/>
+            </w:tcMar>
+          </w:tcPr>
+          <w:p>
+            <w:r>
+              <w:rPr>
+                <w:rFonts w:ascii="Arial" w:eastAsia="Microsoft YaHei"/>
+              </w:rPr>
+              <w:t xml:space="preserve">发布时间</w:t>
+            </w:r>
+          </w:p>
+        </w:tc>
+        <w:tc>
+          <w:tcPr>
+            <w:tcW w:type="dxa" w:w="1504"/>
+            <w:tcBorders>
+              <w:top w:val="single" w:color="CCCCCC" w:sz="1"/>
+              <w:left w:val="single" w:color="CCCCCC" w:sz="1"/>
+              <w:bottom w:val="single" w:color="CCCCCC" w:sz="1"/>
+              <w:right w:val="single" w:color="CCCCCC" w:sz="1"/>
+            </w:tcBorders>
+            <w:shd w:fill="D5E8F0" w:val="clear"/>
+            <w:tcMar>
+              <w:top w:type="dxa" w:w="80"/>
+              <w:left w:type="dxa" w:w="120"/>
+              <w:bottom w:type="dxa" w:w="80"/>
+              <w:right w:type="dxa" w:w="120"/>
+            </w:tcMar>
+          </w:tcPr>
+          <w:p>
+            <w:r>
+              <w:rPr>
+                <w:rFonts w:ascii="Arial" w:eastAsia="Microsoft YaHei"/>
+              </w:rPr>
+              <w:t xml:space="preserve">特点</w:t>
+            </w:r>
+          </w:p>
+        </w:tc>
+      </w:tr>
+      <w:tr>
+        <w:tc>
+          <w:tcPr>
+            <w:tcW w:type="dxa" w:w="1504"/>
+            <w:tcBorders>
+              <w:top w:val="single" w:color="CCCCCC" w:sz="1"/>
+              <w:left w:val="single" w:color="CCCCCC" w:sz="1"/>
+              <w:bottom w:val="single" w:color="CCCCCC" w:sz="1"/>
+              <w:right w:val="single" w:color="CCCCCC" w:sz="1"/>
+            </w:tcBorders>
+            <w:tcMar>
+              <w:top w:type="dxa" w:w="80"/>
+              <w:left w:type="dxa" w:w="120"/>
+              <w:bottom w:type="dxa" w:w="80"/>
+              <w:right w:type="dxa" w:w="120"/>
+            </w:tcMar>
+          </w:tcPr>
+          <w:p>
+            <w:r>
+              <w:rPr>
+                <w:rFonts w:ascii="Arial" w:eastAsia="Microsoft YaHei"/>
+              </w:rPr>
+              <w:t xml:space="preserve">Qwen3.6-35B-A3B</w:t>
+            </w:r>
+          </w:p>
+        </w:tc>
+        <w:tc>
+          <w:tcPr>
+            <w:tcW w:type="dxa" w:w="1504"/>
+            <w:tcBorders>
+              <w:top w:val="single" w:color="CCCCCC" w:sz="1"/>
+              <w:left w:val="single" w:color="CCCCCC" w:sz="1"/>
+              <w:bottom w:val="single" w:color="CCCCCC" w:sz="1"/>
+              <w:right w:val="single" w:color="CCCCCC" w:sz="1"/>
+            </w:tcBorders>
+            <w:tcMar>
+              <w:top w:type="dxa" w:w="80"/>
+              <w:left w:type="dxa" w:w="120"/>
+              <w:bottom w:type="dxa" w:w="80"/>
+              <w:right w:type="dxa" w:w="120"/>
+            </w:tcMar>
+          </w:tcPr>
+          <w:p>
+            <w:r>
+              <w:rPr>
+                <w:rFonts w:ascii="Arial" w:eastAsia="Microsoft YaHei"/>
+              </w:rPr>
+              <w:t xml:space="preserve">MoE</w:t>
+            </w:r>
+          </w:p>
+        </w:tc>
+        <w:tc>
+          <w:tcPr>
+            <w:tcW w:type="dxa" w:w="1504"/>
+            <w:tcBorders>
+              <w:top w:val="single" w:color="CCCCCC" w:sz="1"/>
+              <w:left w:val="single" w:color="CCCCCC" w:sz="1"/>
+              <w:bottom w:val="single" w:color="CCCCCC" w:sz="1"/>
+              <w:right w:val="single" w:color="CCCCCC" w:sz="1"/>
+            </w:tcBorders>
+            <w:tcMar>
+              <w:top w:type="dxa" w:w="80"/>
+              <w:left w:type="dxa" w:w="120"/>
+              <w:bottom w:type="dxa" w:w="80"/>
+              <w:right w:type="dxa" w:w="120"/>
+            </w:tcMar>
+          </w:tcPr>
+          <w:p>
+            <w:r>
+              <w:rPr>
+                <w:rFonts w:ascii="Arial" w:eastAsia="Microsoft YaHei"/>
+              </w:rPr>
+              <w:t xml:space="preserve">35B</w:t>
+            </w:r>
+          </w:p>
+        </w:tc>
+        <w:tc>
+          <w:tcPr>
+            <w:tcW w:type="dxa" w:w="1504"/>
+            <w:tcBorders>
+              <w:top w:val="single" w:color="CCCCCC" w:sz="1"/>
+              <w:left w:val="single" w:color="CCCCCC" w:sz="1"/>
+              <w:bottom w:val="single" w:color="CCCCCC" w:sz="1"/>
+              <w:right w:val="single" w:color="CCCCCC" w:sz="1"/>
+            </w:tcBorders>
+            <w:tcMar>
+              <w:top w:type="dxa" w:w="80"/>
+              <w:left w:type="dxa" w:w="120"/>
+              <w:bottom w:type="dxa" w:w="80"/>
+              <w:right w:type="dxa" w:w="120"/>
+            </w:tcMar>
+          </w:tcPr>
+          <w:p>
+            <w:r>
+              <w:rPr>
+                <w:rFonts w:ascii="Arial" w:eastAsia="Microsoft YaHei"/>
+              </w:rPr>
+              <w:t xml:space="preserve">3B</w:t>
+            </w:r>
+          </w:p>
+        </w:tc>
+        <w:tc>
+          <w:tcPr>
+            <w:tcW w:type="dxa" w:w="1504"/>
+            <w:tcBorders>
+              <w:top w:val="single" w:color="CCCCCC" w:sz="1"/>
+              <w:left w:val="single" w:color="CCCCCC" w:sz="1"/>
+              <w:bottom w:val="single" w:color="CCCCCC" w:sz="1"/>
+              <w:right w:val="single" w:color="CCCCCC" w:sz="1"/>
+            </w:tcBorders>
+            <w:tcMar>
+              <w:top w:type="dxa" w:w="80"/>
+              <w:left w:type="dxa" w:w="120"/>
+              <w:bottom w:type="dxa" w:w="80"/>
+              <w:right w:type="dxa" w:w="120"/>
+            </w:tcMar>
+          </w:tcPr>
+          <w:p>
+            <w:r>
+              <w:rPr>
+                <w:rFonts w:ascii="Arial" w:eastAsia="Microsoft YaHei"/>
+              </w:rPr>
+              <w:t xml:space="preserve">2026.04</w:t>
+            </w:r>
+          </w:p>
+        </w:tc>
+        <w:tc>
+          <w:tcPr>
+            <w:tcW w:type="dxa" w:w="1504"/>
+            <w:tcBorders>
+              <w:top w:val="single" w:color="CCCCCC" w:sz="1"/>
+              <w:left w:val="single" w:color="CCCCCC" w:sz="1"/>
+              <w:bottom w:val="single" w:color="CCCCCC" w:sz="1"/>
+              <w:right w:val="single" w:color="CCCCCC" w:sz="1"/>
+            </w:tcBorders>
+            <w:tcMar>
+              <w:top w:type="dxa" w:w="80"/>
+              <w:left w:type="dxa" w:w="120"/>
+              <w:bottom w:type="dxa" w:w="80"/>
+              <w:right w:type="dxa" w:w="120"/>
+            </w:tcMar>
+          </w:tcPr>
+          <w:p>
+            <w:r>
+              <w:rPr>
+                <w:rFonts w:ascii="Arial" w:eastAsia="Microsoft YaHei"/>
+              </w:rPr>
+              <w:t xml:space="preserve">Agent 编码强化，思维上下文保持</w:t>
+            </w:r>
+          </w:p>
+        </w:tc>
+      </w:tr>
+      <w:tr>
+        <w:tc>
+          <w:tcPr>
+            <w:tcW w:type="dxa" w:w="1504"/>
+            <w:tcBorders>
+              <w:top w:val="single" w:color="CCCCCC" w:sz="1"/>
+              <w:left w:val="single" w:color="CCCCCC" w:sz="1"/>
+              <w:bottom w:val="single" w:color="CCCCCC" w:sz="1"/>
+              <w:right w:val="single" w:color="CCCCCC" w:sz="1"/>
+            </w:tcBorders>
+            <w:tcMar>
+              <w:top w:type="dxa" w:w="80"/>
+              <w:left w:type="dxa" w:w="120"/>
+              <w:bottom w:type="dxa" w:w="80"/>
+              <w:right w:type="dxa" w:w="120"/>
+            </w:tcMar>
+          </w:tcPr>
+          <w:p>
+            <w:r>
+              <w:rPr>
+                <w:rFonts w:ascii="Arial" w:eastAsia="Microsoft YaHei"/>
+              </w:rPr>
+              <w:t xml:space="preserve">Qwen3.6-27B</w:t>
+            </w:r>
+          </w:p>
+        </w:tc>
+        <w:tc>
+          <w:tcPr>
+            <w:tcW w:type="dxa" w:w="1504"/>
+            <w:tcBorders>
+              <w:top w:val="single" w:color="CCCCCC" w:sz="1"/>
+              <w:left w:val="single" w:color="CCCCCC" w:sz="1"/>
+              <w:bottom w:val="single" w:color="CCCCCC" w:sz="1"/>
+              <w:right w:val="single" w:color="CCCCCC" w:sz="1"/>
+            </w:tcBorders>
+            <w:tcMar>
+              <w:top w:type="dxa" w:w="80"/>
+              <w:left w:type="dxa" w:w="120"/>
+              <w:bottom w:type="dxa" w:w="80"/>
+              <w:right w:type="dxa" w:w="120"/>
+            </w:tcMar>
+          </w:tcPr>
+          <w:p>
+            <w:r>
+              <w:rPr>
+                <w:rFonts w:ascii="Arial" w:eastAsia="Microsoft YaHei"/>
+              </w:rPr>
+              <w:t xml:space="preserve">Dense</w:t>
+            </w:r>
+          </w:p>
+        </w:tc>
+        <w:tc>
+          <w:tcPr>
+            <w:tcW w:type="dxa" w:w="1504"/>
+            <w:tcBorders>
+              <w:top w:val="single" w:color="CCCCCC" w:sz="1"/>
+              <w:left w:val="single" w:color="CCCCCC" w:sz="1"/>
+              <w:bottom w:val="single" w:color="CCCCCC" w:sz="1"/>
+              <w:right w:val="single" w:color="CCCCCC" w:sz="1"/>
+            </w:tcBorders>
+            <w:tcMar>
+              <w:top w:type="dxa" w:w="80"/>
+              <w:left w:type="dxa" w:w="120"/>
+              <w:bottom w:type="dxa" w:w="80"/>
+              <w:right w:type="dxa" w:w="120"/>
+            </w:tcMar>
+          </w:tcPr>
+          <w:p>
+            <w:r>
+              <w:rPr>
+                <w:rFonts w:ascii="Arial" w:eastAsia="Microsoft YaHei"/>
+              </w:rPr>
+              <w:t xml:space="preserve">27B</w:t>
+            </w:r>
+          </w:p>
+        </w:tc>
+        <w:tc>
+          <w:tcPr>
+            <w:tcW w:type="dxa" w:w="1504"/>
+            <w:tcBorders>
+              <w:top w:val="single" w:color="CCCCCC" w:sz="1"/>
+              <w:left w:val="single" w:color="CCCCCC" w:sz="1"/>
+              <w:bottom w:val="single" w:color="CCCCCC" w:sz="1"/>
+              <w:right w:val="single" w:color="CCCCCC" w:sz="1"/>
+            </w:tcBorders>
+            <w:tcMar>
+              <w:top w:type="dxa" w:w="80"/>
+              <w:left w:type="dxa" w:w="120"/>
+              <w:bottom w:type="dxa" w:w="80"/>
+              <w:right w:type="dxa" w:w="120"/>
+            </w:tcMar>
+          </w:tcPr>
+          <w:p>
+            <w:r>
+              <w:rPr>
+                <w:rFonts w:ascii="Arial" w:eastAsia="Microsoft YaHei"/>
+              </w:rPr>
+              <w:t xml:space="preserve">27B</w:t>
+            </w:r>
+          </w:p>
+        </w:tc>
+        <w:tc>
+          <w:tcPr>
+            <w:tcW w:type="dxa" w:w="1504"/>
+            <w:tcBorders>
+              <w:top w:val="single" w:color="CCCCCC" w:sz="1"/>
+              <w:left w:val="single" w:color="CCCCCC" w:sz="1"/>
+              <w:bottom w:val="single" w:color="CCCCCC" w:sz="1"/>
+              <w:right w:val="single" w:color="CCCCCC" w:sz="1"/>
+            </w:tcBorders>
+            <w:tcMar>
+              <w:top w:type="dxa" w:w="80"/>
+              <w:left w:type="dxa" w:w="120"/>
+              <w:bottom w:type="dxa" w:w="80"/>
+              <w:right w:type="dxa" w:w="120"/>
+            </w:tcMar>
+          </w:tcPr>
+          <w:p>
+            <w:r>
+              <w:rPr>
+                <w:rFonts w:ascii="Arial" w:eastAsia="Microsoft YaHei"/>
+              </w:rPr>
+              <w:t xml:space="preserve">2026.04</w:t>
+            </w:r>
+          </w:p>
+        </w:tc>
+        <w:tc>
+          <w:tcPr>
+            <w:tcW w:type="dxa" w:w="1504"/>
+            <w:tcBorders>
+              <w:top w:val="single" w:color="CCCCCC" w:sz="1"/>
+              <w:left w:val="single" w:color="CCCCCC" w:sz="1"/>
+              <w:bottom w:val="single" w:color="CCCCCC" w:sz="1"/>
+              <w:right w:val="single" w:color="CCCCCC" w:sz="1"/>
+            </w:tcBorders>
+            <w:tcMar>
+              <w:top w:type="dxa" w:w="80"/>
+              <w:left w:type="dxa" w:w="120"/>
+              <w:bottom w:type="dxa" w:w="80"/>
+              <w:right w:type="dxa" w:w="120"/>
+            </w:tcMar>
+          </w:tcPr>
+          <w:p>
+            <w:r>
+              <w:rPr>
+                <w:rFonts w:ascii="Arial" w:eastAsia="Microsoft YaHei"/>
+              </w:rPr>
+              <w:t xml:space="preserve">密集架构，稳定推理</w:t>
+            </w:r>
+          </w:p>
+        </w:tc>
+      </w:tr>
+      <w:tr>
+        <w:tc>
+          <w:tcPr>
+            <w:tcW w:type="dxa" w:w="1504"/>
+            <w:tcBorders>
+              <w:top w:val="single" w:color="CCCCCC" w:sz="1"/>
+              <w:left w:val="single" w:color="CCCCCC" w:sz="1"/>
+              <w:bottom w:val="single" w:color="CCCCCC" w:sz="1"/>
+              <w:right w:val="single" w:color="CCCCCC" w:sz="1"/>
+            </w:tcBorders>
+            <w:tcMar>
+              <w:top w:type="dxa" w:w="80"/>
+              <w:left w:type="dxa" w:w="120"/>
+              <w:bottom w:type="dxa" w:w="80"/>
+              <w:right w:type="dxa" w:w="120"/>
+            </w:tcMar>
+          </w:tcPr>
+          <w:p>
+            <w:r>
+              <w:rPr>
+                <w:rFonts w:ascii="Arial" w:eastAsia="Microsoft YaHei"/>
+              </w:rPr>
+              <w:t xml:space="preserve">Qwen3.5-35B-A3B</w:t>
+            </w:r>
+          </w:p>
+        </w:tc>
+        <w:tc>
+          <w:tcPr>
+            <w:tcW w:type="dxa" w:w="1504"/>
+            <w:tcBorders>
+              <w:top w:val="single" w:color="CCCCCC" w:sz="1"/>
+              <w:left w:val="single" w:color="CCCCCC" w:sz="1"/>
+              <w:bottom w:val="single" w:color="CCCCCC" w:sz="1"/>
+              <w:right w:val="single" w:color="CCCCCC" w:sz="1"/>
+            </w:tcBorders>
+            <w:tcMar>
+              <w:top w:type="dxa" w:w="80"/>
+              <w:left w:type="dxa" w:w="120"/>
+              <w:bottom w:type="dxa" w:w="80"/>
+              <w:right w:type="dxa" w:w="120"/>
+            </w:tcMar>
+          </w:tcPr>
+          <w:p>
+            <w:r>
+              <w:rPr>
+                <w:rFonts w:ascii="Arial" w:eastAsia="Microsoft YaHei"/>
+              </w:rPr>
+              <w:t xml:space="preserve">MoE</w:t>
+            </w:r>
+          </w:p>
+        </w:tc>
+        <w:tc>
+          <w:tcPr>
+            <w:tcW w:type="dxa" w:w="1504"/>
+            <w:tcBorders>
+              <w:top w:val="single" w:color="CCCCCC" w:sz="1"/>
+              <w:left w:val="single" w:color="CCCCCC" w:sz="1"/>
+              <w:bottom w:val="single" w:color="CCCCCC" w:sz="1"/>
+              <w:right w:val="single" w:color="CCCCCC" w:sz="1"/>
+            </w:tcBorders>
+            <w:tcMar>
+              <w:top w:type="dxa" w:w="80"/>
+              <w:left w:type="dxa" w:w="120"/>
+              <w:bottom w:type="dxa" w:w="80"/>
+              <w:right w:type="dxa" w:w="120"/>
+            </w:tcMar>
+          </w:tcPr>
+          <w:p>
+            <w:r>
+              <w:rPr>
+                <w:rFonts w:ascii="Arial" w:eastAsia="Microsoft YaHei"/>
+              </w:rPr>
+              <w:t xml:space="preserve">35B</w:t>
+            </w:r>
+          </w:p>
+        </w:tc>
+        <w:tc>
+          <w:tcPr>
+            <w:tcW w:type="dxa" w:w="1504"/>
+            <w:tcBorders>
+              <w:top w:val="single" w:color="CCCCCC" w:sz="1"/>
+              <w:left w:val="single" w:color="CCCCCC" w:sz="1"/>
+              <w:bottom w:val="single" w:color="CCCCCC" w:sz="1"/>
+              <w:right w:val="single" w:color="CCCCCC" w:sz="1"/>
+            </w:tcBorders>
+            <w:tcMar>
+              <w:top w:type="dxa" w:w="80"/>
+              <w:left w:type="dxa" w:w="120"/>
+              <w:bottom w:type="dxa" w:w="80"/>
+              <w:right w:type="dxa" w:w="120"/>
+            </w:tcMar>
+          </w:tcPr>
+          <w:p>
+            <w:r>
+              <w:rPr>
+                <w:rFonts w:ascii="Arial" w:eastAsia="Microsoft YaHei"/>
+              </w:rPr>
+              <w:t xml:space="preserve">3B</w:t>
+            </w:r>
+          </w:p>
+        </w:tc>
+        <w:tc>
+          <w:tcPr>
+            <w:tcW w:type="dxa" w:w="1504"/>
+            <w:tcBorders>
+              <w:top w:val="single" w:color="CCCCCC" w:sz="1"/>
+              <w:left w:val="single" w:color="CCCCCC" w:sz="1"/>
+              <w:bottom w:val="single" w:color="CCCCCC" w:sz="1"/>
+              <w:right w:val="single" w:color="CCCCCC" w:sz="1"/>
+            </w:tcBorders>
+            <w:tcMar>
+              <w:top w:type="dxa" w:w="80"/>
+              <w:left w:type="dxa" w:w="120"/>
+              <w:bottom w:type="dxa" w:w="80"/>
+              <w:right w:type="dxa" w:w="120"/>
+            </w:tcMar>
+          </w:tcPr>
+          <w:p>
+            <w:r>
+              <w:rPr>
+                <w:rFonts w:ascii="Arial" w:eastAsia="Microsoft YaHei"/>
+              </w:rPr>
+              <w:t xml:space="preserve">2026.02</w:t>
+            </w:r>
+          </w:p>
+        </w:tc>
+        <w:tc>
+          <w:tcPr>
+            <w:tcW w:type="dxa" w:w="1504"/>
+            <w:tcBorders>
+              <w:top w:val="single" w:color="CCCCCC" w:sz="1"/>
+              <w:left w:val="single" w:color="CCCCCC" w:sz="1"/>
+              <w:bottom w:val="single" w:color="CCCCCC" w:sz="1"/>
+              <w:right w:val="single" w:color="CCCCCC" w:sz="1"/>
+            </w:tcBorders>
+            <w:tcMar>
+              <w:top w:type="dxa" w:w="80"/>
+              <w:left w:type="dxa" w:w="120"/>
+              <w:bottom w:type="dxa" w:w="80"/>
+              <w:right w:type="dxa" w:w="120"/>
+            </w:tcMar>
+          </w:tcPr>
+          <w:p>
+            <w:r>
+              <w:rPr>
+                <w:rFonts w:ascii="Arial" w:eastAsia="Microsoft YaHei"/>
+              </w:rPr>
+              <w:t xml:space="preserve">高稀疏 MoE，多模态</w:t>
+            </w:r>
+          </w:p>
+        </w:tc>
+      </w:tr>
+      <w:tr>
+        <w:tc>
+          <w:tcPr>
+            <w:tcW w:type="dxa" w:w="1504"/>
+            <w:tcBorders>
+              <w:top w:val="single" w:color="CCCCCC" w:sz="1"/>
+              <w:left w:val="single" w:color="CCCCCC" w:sz="1"/>
+              <w:bottom w:val="single" w:color="CCCCCC" w:sz="1"/>
+              <w:right w:val="single" w:color="CCCCCC" w:sz="1"/>
+            </w:tcBorders>
+            <w:tcMar>
+              <w:top w:type="dxa" w:w="80"/>
+              <w:left w:type="dxa" w:w="120"/>
+              <w:bottom w:type="dxa" w:w="80"/>
+              <w:right w:type="dxa" w:w="120"/>
+            </w:tcMar>
+          </w:tcPr>
+          <w:p>
+            <w:r>
+              <w:rPr>
+                <w:rFonts w:ascii="Arial" w:eastAsia="Microsoft YaHei"/>
+              </w:rPr>
+              <w:t xml:space="preserve">Qwen3.5-27B</w:t>
+            </w:r>
+          </w:p>
+        </w:tc>
+        <w:tc>
+          <w:tcPr>
+            <w:tcW w:type="dxa" w:w="1504"/>
+            <w:tcBorders>
+              <w:top w:val="single" w:color="CCCCCC" w:sz="1"/>
+              <w:left w:val="single" w:color="CCCCCC" w:sz="1"/>
+              <w:bottom w:val="single" w:color="CCCCCC" w:sz="1"/>
+              <w:right w:val="single" w:color="CCCCCC" w:sz="1"/>
+            </w:tcBorders>
+            <w:tcMar>
+              <w:top w:type="dxa" w:w="80"/>
+              <w:left w:type="dxa" w:w="120"/>
+              <w:bottom w:type="dxa" w:w="80"/>
+              <w:right w:type="dxa" w:w="120"/>
+            </w:tcMar>
+          </w:tcPr>
+          <w:p>
+            <w:r>
+              <w:rPr>
+                <w:rFonts w:ascii="Arial" w:eastAsia="Microsoft YaHei"/>
+              </w:rPr>
+              <w:t xml:space="preserve">Dense</w:t>
+            </w:r>
+          </w:p>
+        </w:tc>
+        <w:tc>
+          <w:tcPr>
+            <w:tcW w:type="dxa" w:w="1504"/>
+            <w:tcBorders>
+              <w:top w:val="single" w:color="CCCCCC" w:sz="1"/>
+              <w:left w:val="single" w:color="CCCCCC" w:sz="1"/>
+              <w:bottom w:val="single" w:color="CCCCCC" w:sz="1"/>
+              <w:right w:val="single" w:color="CCCCCC" w:sz="1"/>
+            </w:tcBorders>
+            <w:tcMar>
+              <w:top w:type="dxa" w:w="80"/>
+              <w:left w:type="dxa" w:w="120"/>
+              <w:bottom w:type="dxa" w:w="80"/>
+              <w:right w:type="dxa" w:w="120"/>
+            </w:tcMar>
+          </w:tcPr>
+          <w:p>
+            <w:r>
+              <w:rPr>
+                <w:rFonts w:ascii="Arial" w:eastAsia="Microsoft YaHei"/>
+              </w:rPr>
+              <w:t xml:space="preserve">27B</w:t>
+            </w:r>
+          </w:p>
+        </w:tc>
+        <w:tc>
+          <w:tcPr>
+            <w:tcW w:type="dxa" w:w="1504"/>
+            <w:tcBorders>
+              <w:top w:val="single" w:color="CCCCCC" w:sz="1"/>
+              <w:left w:val="single" w:color="CCCCCC" w:sz="1"/>
+              <w:bottom w:val="single" w:color="CCCCCC" w:sz="1"/>
+              <w:right w:val="single" w:color="CCCCCC" w:sz="1"/>
+            </w:tcBorders>
+            <w:tcMar>
+              <w:top w:type="dxa" w:w="80"/>
+              <w:left w:type="dxa" w:w="120"/>
+              <w:bottom w:type="dxa" w:w="80"/>
+              <w:right w:type="dxa" w:w="120"/>
+            </w:tcMar>
+          </w:tcPr>
+          <w:p>
+            <w:r>
+              <w:rPr>
+                <w:rFonts w:ascii="Arial" w:eastAsia="Microsoft YaHei"/>
+              </w:rPr>
+              <w:t xml:space="preserve">27B</w:t>
+            </w:r>
+          </w:p>
+        </w:tc>
+        <w:tc>
+          <w:tcPr>
+            <w:tcW w:type="dxa" w:w="1504"/>
+            <w:tcBorders>
+              <w:top w:val="single" w:color="CCCCCC" w:sz="1"/>
+              <w:left w:val="single" w:color="CCCCCC" w:sz="1"/>
+              <w:bottom w:val="single" w:color="CCCCCC" w:sz="1"/>
+              <w:right w:val="single" w:color="CCCCCC" w:sz="1"/>
+            </w:tcBorders>
+            <w:tcMar>
+              <w:top w:type="dxa" w:w="80"/>
+              <w:left w:type="dxa" w:w="120"/>
+              <w:bottom w:type="dxa" w:w="80"/>
+              <w:right w:type="dxa" w:w="120"/>
+            </w:tcMar>
+          </w:tcPr>
+          <w:p>
+            <w:r>
+              <w:rPr>
+                <w:rFonts w:ascii="Arial" w:eastAsia="Microsoft YaHei"/>
+              </w:rPr>
+              <w:t xml:space="preserve">2026.02</w:t>
+            </w:r>
+          </w:p>
+        </w:tc>
+        <w:tc>
+          <w:tcPr>
+            <w:tcW w:type="dxa" w:w="1504"/>
+            <w:tcBorders>
+              <w:top w:val="single" w:color="CCCCCC" w:sz="1"/>
+              <w:left w:val="single" w:color="CCCCCC" w:sz="1"/>
+              <w:bottom w:val="single" w:color="CCCCCC" w:sz="1"/>
+              <w:right w:val="single" w:color="CCCCCC" w:sz="1"/>
+            </w:tcBorders>
+            <w:tcMar>
+              <w:top w:type="dxa" w:w="80"/>
+              <w:left w:type="dxa" w:w="120"/>
+              <w:bottom w:type="dxa" w:w="80"/>
+              <w:right w:type="dxa" w:w="120"/>
+            </w:tcMar>
+          </w:tcPr>
+          <w:p>
+            <w:r>
+              <w:rPr>
+                <w:rFonts w:ascii="Arial" w:eastAsia="Microsoft YaHei"/>
+              </w:rPr>
+              <w:t xml:space="preserve">首个中型 Dense 模型</w:t>
+            </w:r>
+          </w:p>
+        </w:tc>
+      </w:tr>
+      <w:tr>
+        <w:tc>
+          <w:tcPr>
+            <w:tcW w:type="dxa" w:w="1504"/>
+            <w:tcBorders>
+              <w:top w:val="single" w:color="CCCCCC" w:sz="1"/>
+              <w:left w:val="single" w:color="CCCCCC" w:sz="1"/>
+              <w:bottom w:val="single" w:color="CCCCCC" w:sz="1"/>
+              <w:right w:val="single" w:color="CCCCCC" w:sz="1"/>
+            </w:tcBorders>
+            <w:tcMar>
+              <w:top w:type="dxa" w:w="80"/>
+              <w:left w:type="dxa" w:w="120"/>
+              <w:bottom w:type="dxa" w:w="80"/>
+              <w:right w:type="dxa" w:w="120"/>
+            </w:tcMar>
+          </w:tcPr>
+          <w:p>
+            <w:r>
+              <w:rPr>
+                <w:rFonts w:ascii="Arial" w:eastAsia="Microsoft YaHei"/>
+              </w:rPr>
+              <w:t xml:space="preserve">Qwen3.5-122B-A10B</w:t>
+            </w:r>
+          </w:p>
+        </w:tc>
+        <w:tc>
+          <w:tcPr>
+            <w:tcW w:type="dxa" w:w="1504"/>
+            <w:tcBorders>
+              <w:top w:val="single" w:color="CCCCCC" w:sz="1"/>
+              <w:left w:val="single" w:color="CCCCCC" w:sz="1"/>
+              <w:bottom w:val="single" w:color="CCCCCC" w:sz="1"/>
+              <w:right w:val="single" w:color="CCCCCC" w:sz="1"/>
+            </w:tcBorders>
+            <w:tcMar>
+              <w:top w:type="dxa" w:w="80"/>
+              <w:left w:type="dxa" w:w="120"/>
+              <w:bottom w:type="dxa" w:w="80"/>
+              <w:right w:type="dxa" w:w="120"/>
+            </w:tcMar>
+          </w:tcPr>
+          <w:p>
+            <w:r>
+              <w:rPr>
+                <w:rFonts w:ascii="Arial" w:eastAsia="Microsoft YaHei"/>
+              </w:rPr>
+              <w:t xml:space="preserve">MoE</w:t>
+            </w:r>
+          </w:p>
+        </w:tc>
+        <w:tc>
+          <w:tcPr>
+            <w:tcW w:type="dxa" w:w="1504"/>
+            <w:tcBorders>
+              <w:top w:val="single" w:color="CCCCCC" w:sz="1"/>
+              <w:left w:val="single" w:color="CCCCCC" w:sz="1"/>
+              <w:bottom w:val="single" w:color="CCCCCC" w:sz="1"/>
+              <w:right w:val="single" w:color="CCCCCC" w:sz="1"/>
+            </w:tcBorders>
+            <w:tcMar>
+              <w:top w:type="dxa" w:w="80"/>
+              <w:left w:type="dxa" w:w="120"/>
+              <w:bottom w:type="dxa" w:w="80"/>
+              <w:right w:type="dxa" w:w="120"/>
+            </w:tcMar>
+          </w:tcPr>
+          <w:p>
+            <w:r>
+              <w:rPr>
+                <w:rFonts w:ascii="Arial" w:eastAsia="Microsoft YaHei"/>
+              </w:rPr>
+              <w:t xml:space="preserve">122B</w:t>
+            </w:r>
+          </w:p>
+        </w:tc>
+        <w:tc>
+          <w:tcPr>
+            <w:tcW w:type="dxa" w:w="1504"/>
+            <w:tcBorders>
+              <w:top w:val="single" w:color="CCCCCC" w:sz="1"/>
+              <w:left w:val="single" w:color="CCCCCC" w:sz="1"/>
+              <w:bottom w:val="single" w:color="CCCCCC" w:sz="1"/>
+              <w:right w:val="single" w:color="CCCCCC" w:sz="1"/>
+            </w:tcBorders>
+            <w:tcMar>
+              <w:top w:type="dxa" w:w="80"/>
+              <w:left w:type="dxa" w:w="120"/>
+              <w:bottom w:type="dxa" w:w="80"/>
+              <w:right w:type="dxa" w:w="120"/>
+            </w:tcMar>
+          </w:tcPr>
+          <w:p>
+            <w:r>
+              <w:rPr>
+                <w:rFonts w:ascii="Arial" w:eastAsia="Microsoft YaHei"/>
+              </w:rPr>
+              <w:t xml:space="preserve">10B</w:t>
+            </w:r>
+          </w:p>
+        </w:tc>
+        <w:tc>
+          <w:tcPr>
+            <w:tcW w:type="dxa" w:w="1504"/>
+            <w:tcBorders>
+              <w:top w:val="single" w:color="CCCCCC" w:sz="1"/>
+              <w:left w:val="single" w:color="CCCCCC" w:sz="1"/>
+              <w:bottom w:val="single" w:color="CCCCCC" w:sz="1"/>
+              <w:right w:val="single" w:color="CCCCCC" w:sz="1"/>
+            </w:tcBorders>
+            <w:tcMar>
+              <w:top w:type="dxa" w:w="80"/>
+              <w:left w:type="dxa" w:w="120"/>
+              <w:bottom w:type="dxa" w:w="80"/>
+              <w:right w:type="dxa" w:w="120"/>
+            </w:tcMar>
+          </w:tcPr>
+          <w:p>
+            <w:r>
+              <w:rPr>
+                <w:rFonts w:ascii="Arial" w:eastAsia="Microsoft YaHei"/>
+              </w:rPr>
+              <w:t xml:space="preserve">2026.02</w:t>
+            </w:r>
+          </w:p>
+        </w:tc>
+        <w:tc>
+          <w:tcPr>
+            <w:tcW w:type="dxa" w:w="1504"/>
+            <w:tcBorders>
+              <w:top w:val="single" w:color="CCCCCC" w:sz="1"/>
+              <w:left w:val="single" w:color="CCCCCC" w:sz="1"/>
+              <w:bottom w:val="single" w:color="CCCCCC" w:sz="1"/>
+              <w:right w:val="single" w:color="CCCCCC" w:sz="1"/>
+            </w:tcBorders>
+            <w:tcMar>
+              <w:top w:type="dxa" w:w="80"/>
+              <w:left w:type="dxa" w:w="120"/>
+              <w:bottom w:type="dxa" w:w="80"/>
+              <w:right w:type="dxa" w:w="120"/>
+            </w:tcMar>
+          </w:tcPr>
+          <w:p>
+            <w:r>
+              <w:rPr>
+                <w:rFonts w:ascii="Arial" w:eastAsia="Microsoft YaHei"/>
+              </w:rPr>
+              <w:t xml:space="preserve">大模型能力，激活参数仅 10B</w:t>
+            </w:r>
+          </w:p>
+        </w:tc>
+      </w:tr>
+      <w:tr>
+        <w:tc>
+          <w:tcPr>
+            <w:tcW w:type="dxa" w:w="1504"/>
+            <w:tcBorders>
+              <w:top w:val="single" w:color="CCCCCC" w:sz="1"/>
+              <w:left w:val="single" w:color="CCCCCC" w:sz="1"/>
+              <w:bottom w:val="single" w:color="CCCCCC" w:sz="1"/>
+              <w:right w:val="single" w:color="CCCCCC" w:sz="1"/>
+            </w:tcBorders>
+            <w:tcMar>
+              <w:top w:type="dxa" w:w="80"/>
+              <w:left w:type="dxa" w:w="120"/>
+              <w:bottom w:type="dxa" w:w="80"/>
+              <w:right w:type="dxa" w:w="120"/>
+            </w:tcMar>
+          </w:tcPr>
+          <w:p>
+            <w:r>
+              <w:rPr>
+                <w:rFonts w:ascii="Arial" w:eastAsia="Microsoft YaHei"/>
+              </w:rPr>
+              <w:t xml:space="preserve">Qwen3.5-397B-A17B</w:t>
+            </w:r>
+          </w:p>
+        </w:tc>
+        <w:tc>
+          <w:tcPr>
+            <w:tcW w:type="dxa" w:w="1504"/>
+            <w:tcBorders>
+              <w:top w:val="single" w:color="CCCCCC" w:sz="1"/>
+              <w:left w:val="single" w:color="CCCCCC" w:sz="1"/>
+              <w:bottom w:val="single" w:color="CCCCCC" w:sz="1"/>
+              <w:right w:val="single" w:color="CCCCCC" w:sz="1"/>
+            </w:tcBorders>
+            <w:tcMar>
+              <w:top w:type="dxa" w:w="80"/>
+              <w:left w:type="dxa" w:w="120"/>
+              <w:bottom w:type="dxa" w:w="80"/>
+              <w:right w:type="dxa" w:w="120"/>
+            </w:tcMar>
+          </w:tcPr>
+          <w:p>
+            <w:r>
+              <w:rPr>
+                <w:rFonts w:ascii="Arial" w:eastAsia="Microsoft YaHei"/>
+              </w:rPr>
+              <w:t xml:space="preserve">MoE</w:t>
+            </w:r>
+          </w:p>
+        </w:tc>
+        <w:tc>
+          <w:tcPr>
+            <w:tcW w:type="dxa" w:w="1504"/>
+            <w:tcBorders>
+              <w:top w:val="single" w:color="CCCCCC" w:sz="1"/>
+              <w:left w:val="single" w:color="CCCCCC" w:sz="1"/>
+              <w:bottom w:val="single" w:color="CCCCCC" w:sz="1"/>
+              <w:right w:val="single" w:color="CCCCCC" w:sz="1"/>
+            </w:tcBorders>
+            <w:tcMar>
+              <w:top w:type="dxa" w:w="80"/>
+              <w:left w:type="dxa" w:w="120"/>
+              <w:bottom w:type="dxa" w:w="80"/>
+              <w:right w:type="dxa" w:w="120"/>
+            </w:tcMar>
+          </w:tcPr>
+          <w:p>
+            <w:r>
+              <w:rPr>
+                <w:rFonts w:ascii="Arial" w:eastAsia="Microsoft YaHei"/>
+              </w:rPr>
+              <w:t xml:space="preserve">397B</w:t>
+            </w:r>
+          </w:p>
+        </w:tc>
+        <w:tc>
+          <w:tcPr>
+            <w:tcW w:type="dxa" w:w="1504"/>
+            <w:tcBorders>
+              <w:top w:val="single" w:color="CCCCCC" w:sz="1"/>
+              <w:left w:val="single" w:color="CCCCCC" w:sz="1"/>
+              <w:bottom w:val="single" w:color="CCCCCC" w:sz="1"/>
+              <w:right w:val="single" w:color="CCCCCC" w:sz="1"/>
+            </w:tcBorders>
+            <w:tcMar>
+              <w:top w:type="dxa" w:w="80"/>
+              <w:left w:type="dxa" w:w="120"/>
+              <w:bottom w:type="dxa" w:w="80"/>
+              <w:right w:type="dxa" w:w="120"/>
+            </w:tcMar>
+          </w:tcPr>
+          <w:p>
+            <w:r>
+              <w:rPr>
+                <w:rFonts w:ascii="Arial" w:eastAsia="Microsoft YaHei"/>
+              </w:rPr>
+              <w:t xml:space="preserve">17B</w:t>
+            </w:r>
+          </w:p>
+        </w:tc>
+        <w:tc>
+          <w:tcPr>
+            <w:tcW w:type="dxa" w:w="1504"/>
+            <w:tcBorders>
+              <w:top w:val="single" w:color="CCCCCC" w:sz="1"/>
+              <w:left w:val="single" w:color="CCCCCC" w:sz="1"/>
+              <w:bottom w:val="single" w:color="CCCCCC" w:sz="1"/>
+              <w:right w:val="single" w:color="CCCCCC" w:sz="1"/>
+            </w:tcBorders>
+            <w:tcMar>
+              <w:top w:type="dxa" w:w="80"/>
+              <w:left w:type="dxa" w:w="120"/>
+              <w:bottom w:type="dxa" w:w="80"/>
+              <w:right w:type="dxa" w:w="120"/>
+            </w:tcMar>
+          </w:tcPr>
+          <w:p>
+            <w:r>
+              <w:rPr>
+                <w:rFonts w:ascii="Arial" w:eastAsia="Microsoft YaHei"/>
+              </w:rPr>
+              <w:t xml:space="preserve">2026.02</w:t>
+            </w:r>
+          </w:p>
+        </w:tc>
+        <w:tc>
+          <w:tcPr>
+            <w:tcW w:type="dxa" w:w="1504"/>
+            <w:tcBorders>
+              <w:top w:val="single" w:color="CCCCCC" w:sz="1"/>
+              <w:left w:val="single" w:color="CCCCCC" w:sz="1"/>
+              <w:bottom w:val="single" w:color="CCCCCC" w:sz="1"/>
+              <w:right w:val="single" w:color="CCCCCC" w:sz="1"/>
+            </w:tcBorders>
+            <w:tcMar>
+              <w:top w:type="dxa" w:w="80"/>
+              <w:left w:type="dxa" w:w="120"/>
+              <w:bottom w:type="dxa" w:w="80"/>
+              <w:right w:type="dxa" w:w="120"/>
+            </w:tcMar>
+          </w:tcPr>
+          <w:p>
+            <w:r>
+              <w:rPr>
+                <w:rFonts w:ascii="Arial" w:eastAsia="Microsoft YaHei"/>
+              </w:rPr>
+              <w:t xml:space="preserve">旗舰模型</w:t>
+            </w:r>
+          </w:p>
+        </w:tc>
+      </w:tr>
+    </w:tbl>
+    <w:p>
+      <w:r>
+        <w:t xml:space="preserve"/>
+      </w:r>
+    </w:p>
+    <w:p>
+      <w:pPr>
+        <w:spacing w:after="120" w:line="360" w:lineRule="auto"/>
+        <w:ind w:firstLine="480"/>
+      </w:pPr>
+      <w:r>
+        <w:rPr>
+          <w:rFonts w:ascii="Arial" w:eastAsia="Microsoft YaHei"/>
           <w:b/>
           <w:bCs/>
         </w:rPr>
-        <w:t xml:space="preserve">备选：Qwen3-32B</w:t>
-      </w:r>
-      <w:r>
-        <w:rPr>
-          <w:rFonts w:ascii="Arial" w:eastAsia="Microsoft YaHei"/>
-        </w:rPr>
-        <w:t xml:space="preserve">。推理能力更强，适合复杂规则编排和多层策略生成场景，但需要 2 张 L20 做张量并行或 1 张 A100 80GB。适合对策略复杂度要求高的客户。</w:t>
+        <w:t xml:space="preserve">首选：Qwen3.6-35B-A3B</w:t>
+      </w:r>
+      <w:r>
+        <w:rPr>
+          <w:rFonts w:ascii="Arial" w:eastAsia="Microsoft YaHei"/>
+        </w:rPr>
+        <w:t xml:space="preserve">。Apache 2.0 开源协议，商用无限制。总参数 35B 但激活参数仅 3B，推理开销极低——在单张昇腾 910B 64GB 上即可流畅运行 FP16 推理。原生支持 Function Calling、Agent 编码和仓库级推理，是策略配置多步编排场景的最佳选择。Qwen3.6 特有的思维上下文保持（Thinking Preservation）机制可在多轮对话中保留推理链，显著降低迭代开销。</w:t>
       </w:r>
     </w:p>
     <w:p>
@@ -2229,24 +4113,13 @@
           <w:b/>
           <w:bCs/>
         </w:rPr>
-        <w:t xml:space="preserve">备选：DeepSeek-R1-Distill-Qwen-32B</w:t>
-      </w:r>
-      <w:r>
-        <w:rPr>
-          <w:rFonts w:ascii="Arial" w:eastAsia="Microsoft YaHei"/>
-        </w:rPr>
-        <w:t xml:space="preserve">。推理能力突出，适合需要深度分析的场景，但其思维模式与工具调用存在兼容性问题，需要额外适配。</w:t>
-      </w:r>
-    </w:p>
-    <w:p>
-      <w:pPr>
-        <w:pStyle w:val="Heading3"/>
-      </w:pPr>
-      <w:r>
-        <w:rPr>
-          <w:rFonts w:ascii="Arial" w:eastAsia="Microsoft YaHei"/>
-        </w:rPr>
-        <w:t xml:space="preserve">推理引擎</w:t>
+        <w:t xml:space="preserve">备选：Qwen3.5-27B</w:t>
+      </w:r>
+      <w:r>
+        <w:rPr>
+          <w:rFonts w:ascii="Arial" w:eastAsia="Microsoft YaHei"/>
+        </w:rPr>
+        <w:t xml:space="preserve">。密集架构 27B 参数，推理能力略强于 35B-A3B 的激活部分，适合对输出稳定性要求极高的场景。在昇腾 910B 上可运行但显存较紧，推荐 910C 128GB。</w:t>
       </w:r>
     </w:p>
     <w:p>
@@ -2257,22 +4130,16 @@
       <w:r>
         <w:rPr>
           <w:rFonts w:ascii="Arial" w:eastAsia="Microsoft YaHei"/>
-        </w:rPr>
-        <w:t xml:space="preserve">推荐使用 </w:t>
-      </w:r>
-      <w:r>
-        <w:rPr>
-          <w:rFonts w:ascii="Arial" w:eastAsia="Microsoft YaHei"/>
           <w:b/>
           <w:bCs/>
         </w:rPr>
-        <w:t xml:space="preserve">vLLM</w:t>
-      </w:r>
-      <w:r>
-        <w:rPr>
-          <w:rFonts w:ascii="Arial" w:eastAsia="Microsoft YaHei"/>
-        </w:rPr>
-        <w:t xml:space="preserve"> 作为推理引擎。它是目前最成熟的开源 LLM 推理框架，支持 OpenAI 兼容 API（Agent 框架可直接对接）、PagedAttention 显存管理（提升吞吐量）、连续批处理（多会话并发）、离线部署（Docker 镜像离线导入）。</w:t>
+        <w:t xml:space="preserve">高配：Qwen3.5-122B-A10B</w:t>
+      </w:r>
+      <w:r>
+        <w:rPr>
+          <w:rFonts w:ascii="Arial" w:eastAsia="Microsoft YaHei"/>
+        </w:rPr>
+        <w:t xml:space="preserve">。总参数 122B，激活参数 10B，能力对标旗舰级 Qwen3-235B-A22B。需要 2 张昇腾 910C 做张量并行，适合策略复杂度极高或需要同时处理多个项目配置的场景。</w:t>
       </w:r>
     </w:p>
     <w:p>
@@ -2283,8 +4150,87 @@
       <w:r>
         <w:rPr>
           <w:rFonts w:ascii="Arial" w:eastAsia="Microsoft YaHei"/>
-        </w:rPr>
-        <w:t xml:space="preserve">部署方式：</w:t>
+          <w:b/>
+          <w:bCs/>
+        </w:rPr>
+        <w:t xml:space="preserve">备选：DeepSeek-V3.1</w:t>
+      </w:r>
+      <w:r>
+        <w:rPr>
+          <w:rFonts w:ascii="Arial" w:eastAsia="Microsoft YaHei"/>
+        </w:rPr>
+        <w:t xml:space="preserve">。综合能力强，工具调用能力突出，但在昇腾 NPU 上的适配成熟度不如 Qwen 系列，需要额外验证。</w:t>
+      </w:r>
+    </w:p>
+    <w:p>
+      <w:pPr>
+        <w:pStyle w:val="Heading3"/>
+      </w:pPr>
+      <w:r>
+        <w:rPr>
+          <w:rFonts w:ascii="Arial" w:eastAsia="Microsoft YaHei"/>
+        </w:rPr>
+        <w:t xml:space="preserve">推理引擎</w:t>
+      </w:r>
+    </w:p>
+    <w:p>
+      <w:pPr>
+        <w:spacing w:after="120" w:line="360" w:lineRule="auto"/>
+        <w:ind w:firstLine="480"/>
+      </w:pPr>
+      <w:r>
+        <w:rPr>
+          <w:rFonts w:ascii="Arial" w:eastAsia="Microsoft YaHei"/>
+        </w:rPr>
+        <w:t xml:space="preserve">推荐使用 </w:t>
+      </w:r>
+      <w:r>
+        <w:rPr>
+          <w:rFonts w:ascii="Arial" w:eastAsia="Microsoft YaHei"/>
+          <w:b/>
+          <w:bCs/>
+        </w:rPr>
+        <w:t xml:space="preserve">vLLM</w:t>
+      </w:r>
+      <w:r>
+        <w:rPr>
+          <w:rFonts w:ascii="Arial" w:eastAsia="Microsoft YaHei"/>
+        </w:rPr>
+        <w:t xml:space="preserve"> 作为推理引擎。它是目前最成熟的开源 LLM 推理框架，已通过 </w:t>
+      </w:r>
+      <w:r>
+        <w:rPr>
+          <w:rFonts w:ascii="Arial" w:eastAsia="Microsoft YaHei"/>
+          <w:b/>
+          <w:bCs/>
+        </w:rPr>
+        <w:t xml:space="preserve">vLLM Ascend 插件</w:t>
+      </w:r>
+      <w:r>
+        <w:rPr>
+          <w:rFonts w:ascii="Arial" w:eastAsia="Microsoft YaHei"/>
+        </w:rPr>
+        <w:t xml:space="preserve">（vllm-ascend）原生支持华为昇腾 NPU，同时兼容 NVIDIA GPU。核心特性包括：OpenAI 兼容 API（Agent 框架可直接对接）、PagedAttention 显存管理（提升吞吐量）、连续批处理（多会话并发）、离线部署（Docker 镜像离线导入）。</w:t>
+      </w:r>
+    </w:p>
+    <w:p>
+      <w:pPr>
+        <w:spacing w:after="120" w:line="360" w:lineRule="auto"/>
+        <w:ind w:firstLine="480"/>
+      </w:pPr>
+      <w:r>
+        <w:rPr>
+          <w:rFonts w:ascii="Arial" w:eastAsia="Microsoft YaHei"/>
+          <w:b/>
+          <w:bCs/>
+        </w:rPr>
+        <w:t xml:space="preserve">昇腾 NPU 部署方式</w:t>
+      </w:r>
+      <w:r>
+        <w:rPr>
+          <w:rFonts w:ascii="Arial" w:eastAsia="Microsoft YaHei"/>
+        </w:rPr>
+        <w:t xml:space="preserve">：</w:t>
       </w:r>
     </w:p>
     <w:p>
@@ -2297,7 +4243,7 @@
           <w:sz w:val="20"/>
           <w:szCs w:val="20"/>
         </w:rPr>
-        <w:t xml:space="preserve"># 在有外网的中转机拉取 Docker 镜像</w:t>
+        <w:t xml:space="preserve"># 在有外网的中转机拉取 vLLM Ascend Docker 镜像</w:t>
       </w:r>
     </w:p>
     <w:p>
@@ -2310,7 +4256,7 @@
           <w:sz w:val="20"/>
           <w:szCs w:val="20"/>
         </w:rPr>
-        <w:t xml:space="preserve">docker pull vllm/vllm-openai:latest</w:t>
+        <w:t xml:space="preserve">docker pull quay.io/ascend/vllm-ascend:latest</w:t>
       </w:r>
     </w:p>
     <w:p>
@@ -2323,7 +4269,7 @@
           <w:sz w:val="20"/>
           <w:szCs w:val="20"/>
         </w:rPr>
-        <w:t xml:space="preserve">docker save vllm/vllm-openai:latest -o vllm-openai.tar</w:t>
+        <w:t xml:space="preserve">docker save quay.io/ascend/vllm-ascend:latest -o vllm-ascend.tar</w:t>
       </w:r>
     </w:p>
     <w:p>
@@ -2349,7 +4295,7 @@
           <w:sz w:val="20"/>
           <w:szCs w:val="20"/>
         </w:rPr>
-        <w:t xml:space="preserve"># 模型权重提前下载（以 Qwen3-14B 为例）</w:t>
+        <w:t xml:space="preserve"># 模型权重提前下载（以 Qwen3.6-35B-A3B 为例）</w:t>
       </w:r>
     </w:p>
     <w:p>
@@ -2362,7 +4308,7 @@
           <w:sz w:val="20"/>
           <w:szCs w:val="20"/>
         </w:rPr>
-        <w:t xml:space="preserve"># 从 ModelScope 下载 Qwen/Qwen3-14B 到本地目录</w:t>
+        <w:t xml:space="preserve"># 从 ModelScope 下载 Qwen/Qwen3.6-35B-A3B 到本地目录</w:t>
       </w:r>
     </w:p>
     <w:p>
@@ -2388,7 +4334,7 @@
           <w:sz w:val="20"/>
           <w:szCs w:val="20"/>
         </w:rPr>
-        <w:t xml:space="preserve"># FTP 转入内网服务器后启动</w:t>
+        <w:t xml:space="preserve"># 安装 CANN 驱动和固件（华为提供离线安装包）</w:t>
       </w:r>
     </w:p>
     <w:p>
@@ -2401,7 +4347,7 @@
           <w:sz w:val="20"/>
           <w:szCs w:val="20"/>
         </w:rPr>
-        <w:t xml:space="preserve">docker load -i vllm-openai.tar</w:t>
+        <w:t xml:space="preserve"># Ascend-cann-toolkit.run + Ascend-hdk-910b-npu-driver.run</w:t>
       </w:r>
     </w:p>
     <w:p>
@@ -2414,7 +4360,7 @@
           <w:sz w:val="20"/>
           <w:szCs w:val="20"/>
         </w:rPr>
-        <w:t xml:space="preserve">docker run --gpus all \</w:t>
+        <w:t xml:space="preserve"> </w:t>
       </w:r>
     </w:p>
     <w:p>
@@ -2427,7 +4373,7 @@
           <w:sz w:val="20"/>
           <w:szCs w:val="20"/>
         </w:rPr>
-        <w:t xml:space="preserve">  -v /data/models/qwen3-14b:/model \</w:t>
+        <w:t xml:space="preserve"># FTP 转入内网服务器后启动</w:t>
       </w:r>
     </w:p>
     <w:p>
@@ -2440,7 +4386,7 @@
           <w:sz w:val="20"/>
           <w:szCs w:val="20"/>
         </w:rPr>
-        <w:t xml:space="preserve">  -p 8000:8000 \</w:t>
+        <w:t xml:space="preserve">docker load -i vllm-ascend.tar</w:t>
       </w:r>
     </w:p>
     <w:p>
@@ -2453,7 +4399,7 @@
           <w:sz w:val="20"/>
           <w:szCs w:val="20"/>
         </w:rPr>
-        <w:t xml:space="preserve">  vllm/vllm-openai \</w:t>
+        <w:t xml:space="preserve">docker run --device /dev/davinci0 \</w:t>
       </w:r>
     </w:p>
     <w:p>
@@ -2466,7 +4412,7 @@
           <w:sz w:val="20"/>
           <w:szCs w:val="20"/>
         </w:rPr>
-        <w:t xml:space="preserve">  --model /model \</w:t>
+        <w:t xml:space="preserve">  --device /dev/davinci_manager \</w:t>
       </w:r>
     </w:p>
     <w:p>
@@ -2479,7 +4425,7 @@
           <w:sz w:val="20"/>
           <w:szCs w:val="20"/>
         </w:rPr>
-        <w:t xml:space="preserve">  --max-model-len 32768 \</w:t>
+        <w:t xml:space="preserve">  --device /dev/devmm_svm \</w:t>
       </w:r>
     </w:p>
     <w:p>
@@ -2492,6 +4438,123 @@
           <w:sz w:val="20"/>
           <w:szCs w:val="20"/>
         </w:rPr>
+        <w:t xml:space="preserve">  --device /dev/hisi_hdc \</w:t>
+      </w:r>
+    </w:p>
+    <w:p>
+      <w:pPr>
+        <w:shd w:fill="F2F2F2" w:val="clear"/>
+      </w:pPr>
+      <w:r>
+        <w:rPr>
+          <w:rFonts w:ascii="Consolas" w:cs="Consolas" w:eastAsia="Consolas" w:hAnsi="Consolas"/>
+          <w:sz w:val="20"/>
+          <w:szCs w:val="20"/>
+        </w:rPr>
+        <w:t xml:space="preserve">  -v /usr/local/dcmi:/usr/local/dcmi \</w:t>
+      </w:r>
+    </w:p>
+    <w:p>
+      <w:pPr>
+        <w:shd w:fill="F2F2F2" w:val="clear"/>
+      </w:pPr>
+      <w:r>
+        <w:rPr>
+          <w:rFonts w:ascii="Consolas" w:cs="Consolas" w:eastAsia="Consolas" w:hAnsi="Consolas"/>
+          <w:sz w:val="20"/>
+          <w:szCs w:val="20"/>
+        </w:rPr>
+        <w:t xml:space="preserve">  -v /usr/local/bin/npu-smi:/usr/local/bin/npu-smi \</w:t>
+      </w:r>
+    </w:p>
+    <w:p>
+      <w:pPr>
+        <w:shd w:fill="F2F2F2" w:val="clear"/>
+      </w:pPr>
+      <w:r>
+        <w:rPr>
+          <w:rFonts w:ascii="Consolas" w:cs="Consolas" w:eastAsia="Consolas" w:hAnsi="Consolas"/>
+          <w:sz w:val="20"/>
+          <w:szCs w:val="20"/>
+        </w:rPr>
+        <w:t xml:space="preserve">  -v /usr/local/Ascend/driver/lib64:/usr/local/Ascend/driver/lib64 \</w:t>
+      </w:r>
+    </w:p>
+    <w:p>
+      <w:pPr>
+        <w:shd w:fill="F2F2F2" w:val="clear"/>
+      </w:pPr>
+      <w:r>
+        <w:rPr>
+          <w:rFonts w:ascii="Consolas" w:cs="Consolas" w:eastAsia="Consolas" w:hAnsi="Consolas"/>
+          <w:sz w:val="20"/>
+          <w:szCs w:val="20"/>
+        </w:rPr>
+        <w:t xml:space="preserve">  -v /data/models/qwen3.6-35b-a3b:/model \</w:t>
+      </w:r>
+    </w:p>
+    <w:p>
+      <w:pPr>
+        <w:shd w:fill="F2F2F2" w:val="clear"/>
+      </w:pPr>
+      <w:r>
+        <w:rPr>
+          <w:rFonts w:ascii="Consolas" w:cs="Consolas" w:eastAsia="Consolas" w:hAnsi="Consolas"/>
+          <w:sz w:val="20"/>
+          <w:szCs w:val="20"/>
+        </w:rPr>
+        <w:t xml:space="preserve">  -p 8000:8000 \</w:t>
+      </w:r>
+    </w:p>
+    <w:p>
+      <w:pPr>
+        <w:shd w:fill="F2F2F2" w:val="clear"/>
+      </w:pPr>
+      <w:r>
+        <w:rPr>
+          <w:rFonts w:ascii="Consolas" w:cs="Consolas" w:eastAsia="Consolas" w:hAnsi="Consolas"/>
+          <w:sz w:val="20"/>
+          <w:szCs w:val="20"/>
+        </w:rPr>
+        <w:t xml:space="preserve">  quay.io/ascend/vllm-ascend \</w:t>
+      </w:r>
+    </w:p>
+    <w:p>
+      <w:pPr>
+        <w:shd w:fill="F2F2F2" w:val="clear"/>
+      </w:pPr>
+      <w:r>
+        <w:rPr>
+          <w:rFonts w:ascii="Consolas" w:cs="Consolas" w:eastAsia="Consolas" w:hAnsi="Consolas"/>
+          <w:sz w:val="20"/>
+          <w:szCs w:val="20"/>
+        </w:rPr>
+        <w:t xml:space="preserve">  --model /model \</w:t>
+      </w:r>
+    </w:p>
+    <w:p>
+      <w:pPr>
+        <w:shd w:fill="F2F2F2" w:val="clear"/>
+      </w:pPr>
+      <w:r>
+        <w:rPr>
+          <w:rFonts w:ascii="Consolas" w:cs="Consolas" w:eastAsia="Consolas" w:hAnsi="Consolas"/>
+          <w:sz w:val="20"/>
+          <w:szCs w:val="20"/>
+        </w:rPr>
+        <w:t xml:space="preserve">  --max-model-len 32768 \</w:t>
+      </w:r>
+    </w:p>
+    <w:p>
+      <w:pPr>
+        <w:shd w:fill="F2F2F2" w:val="clear"/>
+      </w:pPr>
+      <w:r>
+        <w:rPr>
+          <w:rFonts w:ascii="Consolas" w:cs="Consolas" w:eastAsia="Consolas" w:hAnsi="Consolas"/>
+          <w:sz w:val="20"/>
+          <w:szCs w:val="20"/>
+        </w:rPr>
         <w:t xml:space="preserve">  --tensor-parallel-size 1</w:t>
       </w:r>
     </w:p>
@@ -2503,12 +4566,136 @@
       <w:r>
         <w:rPr>
           <w:rFonts w:ascii="Arial" w:eastAsia="Microsoft YaHei"/>
-        </w:rPr>
-        <w:t xml:space="preserve">启动后提供 OpenAI 兼容的 </w:t>
-      </w:r>
+          <w:b/>
+          <w:bCs/>
+        </w:rPr>
+        <w:t xml:space="preserve">NVIDIA GPU 部署方式</w:t>
+      </w:r>
+      <w:r>
+        <w:rPr>
+          <w:rFonts w:ascii="Arial" w:eastAsia="Microsoft YaHei"/>
+        </w:rPr>
+        <w:t xml:space="preserve">（如客户已有 NVIDIA 显卡）：</w:t>
+      </w:r>
+    </w:p>
+    <w:p>
+      <w:pPr>
+        <w:shd w:fill="F2F2F2" w:val="clear"/>
+      </w:pPr>
       <w:r>
         <w:rPr>
           <w:rFonts w:ascii="Consolas" w:cs="Consolas" w:eastAsia="Consolas" w:hAnsi="Consolas"/>
+          <w:sz w:val="20"/>
+          <w:szCs w:val="20"/>
+        </w:rPr>
+        <w:t xml:space="preserve">docker pull vllm/vllm-openai:latest</w:t>
+      </w:r>
+    </w:p>
+    <w:p>
+      <w:pPr>
+        <w:shd w:fill="F2F2F2" w:val="clear"/>
+      </w:pPr>
+      <w:r>
+        <w:rPr>
+          <w:rFonts w:ascii="Consolas" w:cs="Consolas" w:eastAsia="Consolas" w:hAnsi="Consolas"/>
+          <w:sz w:val="20"/>
+          <w:szCs w:val="20"/>
+        </w:rPr>
+        <w:t xml:space="preserve">docker run --gpus all \</w:t>
+      </w:r>
+    </w:p>
+    <w:p>
+      <w:pPr>
+        <w:shd w:fill="F2F2F2" w:val="clear"/>
+      </w:pPr>
+      <w:r>
+        <w:rPr>
+          <w:rFonts w:ascii="Consolas" w:cs="Consolas" w:eastAsia="Consolas" w:hAnsi="Consolas"/>
+          <w:sz w:val="20"/>
+          <w:szCs w:val="20"/>
+        </w:rPr>
+        <w:t xml:space="preserve">  -v /data/models/qwen3.6-35b-a3b:/model \</w:t>
+      </w:r>
+    </w:p>
+    <w:p>
+      <w:pPr>
+        <w:shd w:fill="F2F2F2" w:val="clear"/>
+      </w:pPr>
+      <w:r>
+        <w:rPr>
+          <w:rFonts w:ascii="Consolas" w:cs="Consolas" w:eastAsia="Consolas" w:hAnsi="Consolas"/>
+          <w:sz w:val="20"/>
+          <w:szCs w:val="20"/>
+        </w:rPr>
+        <w:t xml:space="preserve">  -p 8000:8000 \</w:t>
+      </w:r>
+    </w:p>
+    <w:p>
+      <w:pPr>
+        <w:shd w:fill="F2F2F2" w:val="clear"/>
+      </w:pPr>
+      <w:r>
+        <w:rPr>
+          <w:rFonts w:ascii="Consolas" w:cs="Consolas" w:eastAsia="Consolas" w:hAnsi="Consolas"/>
+          <w:sz w:val="20"/>
+          <w:szCs w:val="20"/>
+        </w:rPr>
+        <w:t xml:space="preserve">  vllm/vllm-openai \</w:t>
+      </w:r>
+    </w:p>
+    <w:p>
+      <w:pPr>
+        <w:shd w:fill="F2F2F2" w:val="clear"/>
+      </w:pPr>
+      <w:r>
+        <w:rPr>
+          <w:rFonts w:ascii="Consolas" w:cs="Consolas" w:eastAsia="Consolas" w:hAnsi="Consolas"/>
+          <w:sz w:val="20"/>
+          <w:szCs w:val="20"/>
+        </w:rPr>
+        <w:t xml:space="preserve">  --model /model \</w:t>
+      </w:r>
+    </w:p>
+    <w:p>
+      <w:pPr>
+        <w:shd w:fill="F2F2F2" w:val="clear"/>
+      </w:pPr>
+      <w:r>
+        <w:rPr>
+          <w:rFonts w:ascii="Consolas" w:cs="Consolas" w:eastAsia="Consolas" w:hAnsi="Consolas"/>
+          <w:sz w:val="20"/>
+          <w:szCs w:val="20"/>
+        </w:rPr>
+        <w:t xml:space="preserve">  --max-model-len 32768 \</w:t>
+      </w:r>
+    </w:p>
+    <w:p>
+      <w:pPr>
+        <w:shd w:fill="F2F2F2" w:val="clear"/>
+      </w:pPr>
+      <w:r>
+        <w:rPr>
+          <w:rFonts w:ascii="Consolas" w:cs="Consolas" w:eastAsia="Consolas" w:hAnsi="Consolas"/>
+          <w:sz w:val="20"/>
+          <w:szCs w:val="20"/>
+        </w:rPr>
+        <w:t xml:space="preserve">  --tensor-parallel-size 1</w:t>
+      </w:r>
+    </w:p>
+    <w:p>
+      <w:pPr>
+        <w:spacing w:after="120" w:line="360" w:lineRule="auto"/>
+        <w:ind w:firstLine="480"/>
+      </w:pPr>
+      <w:r>
+        <w:rPr>
+          <w:rFonts w:ascii="Arial" w:eastAsia="Microsoft YaHei"/>
+        </w:rPr>
+        <w:t xml:space="preserve">两种方式均提供 OpenAI 兼容的 </w:t>
+      </w:r>
+      <w:r>
+        <w:rPr>
+          <w:rFonts w:ascii="Consolas" w:cs="Consolas" w:eastAsia="Consolas" w:hAnsi="Consolas"/>
         </w:rPr>
         <w:t xml:space="preserve">http://localhost:8000/v1/chat/completions</w:t>
       </w:r>
@@ -2516,7 +4703,7 @@
         <w:rPr>
           <w:rFonts w:ascii="Arial" w:eastAsia="Microsoft YaHei"/>
         </w:rPr>
-        <w:t xml:space="preserve"> 接口，Agent 框架直接调用。</w:t>
+        <w:t xml:space="preserve"> 接口，Agent 框架直接调用，无需区分底层硬件。</w:t>
       </w:r>
     </w:p>
     <w:p>
@@ -5470,7 +7657,7 @@
         <w:rPr>
           <w:rFonts w:ascii="Arial" w:eastAsia="Microsoft YaHei"/>
         </w:rPr>
-        <w:t xml:space="preserve">本阶段完成硬件准备和基础软件环境搭建。具体任务包括：GPU 服务器采购或分配、操作系统安装（CentOS 7/8 或 Ubuntu 22.04）、NVIDIA 驱动和 CUDA 安装、Docker 离线安装、Python 3.12 环境搭建、离线依赖包下载与转入。</w:t>
+        <w:t xml:space="preserve">本阶段完成硬件准备和基础软件环境搭建。具体任务包括：昇腾 NPU 服务器采购或分配（华为 Atlas 800 系列）、操作系统安装（CentOS 7/8 或 Ubuntu 22.04）、CANN 驱动和固件安装（Ascend-cann-toolkit + npu-driver）、Docker 离线安装、Python 3.12 环境搭建、离线依赖包下载与转入。</w:t>
       </w:r>
     </w:p>
     <w:p>
@@ -5493,7 +7680,7 @@
         <w:rPr>
           <w:rFonts w:ascii="Arial" w:eastAsia="Microsoft YaHei"/>
         </w:rPr>
-        <w:t xml:space="preserve">本阶段完成 LLM 推理服务的部署和验证。具体任务包括：Qwen3-14B 模型权重下载与转入、vLLM 推理引擎 Docker 部署、OpenAI 兼容 API 启动与验证、模型能力评估测试（中文理解、代码生成、工具调用、长上下文）。</w:t>
+        <w:t xml:space="preserve">本阶段完成 LLM 推理服务的部署和验证。具体任务包括：Qwen3.6-35B-A3B 模型权重下载与转入（从 ModelScope 离线下载）、vLLM Ascend 推理引擎 Docker 部署、OpenAI 兼容 API 启动与验证、模型能力评估测试（中文理解、代码生成、工具调用、长上下文）。</w:t>
       </w:r>
     </w:p>
     <w:p>
@@ -5587,13 +7774,13 @@
           <w:b/>
           <w:bCs/>
         </w:rPr>
-        <w:t xml:space="preserve">GPU 采购周期风险</w:t>
-      </w:r>
-      <w:r>
-        <w:rPr>
-          <w:rFonts w:ascii="Arial" w:eastAsia="Microsoft YaHei"/>
-        </w:rPr>
-        <w:t xml:space="preserve">：NVIDIA L20/L40S 国内渠道供货周期可能较长（4-8 周）。应对措施：提前启动采购流程，或优先使用客户已有的 GPU 服务器。</w:t>
+        <w:t xml:space="preserve">硬件采购周期风险</w:t>
+      </w:r>
+      <w:r>
+        <w:rPr>
+          <w:rFonts w:ascii="Arial" w:eastAsia="Microsoft YaHei"/>
+        </w:rPr>
+        <w:t xml:space="preserve">：华为昇腾 910B/910C 国内渠道供货稳定，但批量采购仍需提前 2-4 周与华为渠道对接。应对措施：提前启动采购流程，或优先使用客户已有的昇腾/GPU 服务器。</w:t>
       </w:r>
     </w:p>
     <w:p>
@@ -5613,7 +7800,7 @@
         <w:rPr>
           <w:rFonts w:ascii="Arial" w:eastAsia="Microsoft YaHei"/>
         </w:rPr>
-        <w:t xml:space="preserve">：14B 模型在极复杂的策略编排场景下可能表现不佳。应对措施：预留升级到 32B 模型的路径（增加 GPU 或换用 A100），同时优化 Skill 的 Prompt 工程降低模型负担。</w:t>
+        <w:t xml:space="preserve">：Qwen3.6-35B-A3B 的激活参数仅 3B，在极复杂的策略编排场景下可能表现不如大参数 Dense 模型。应对措施：预留升级到 Qwen3.5-122B-A10B 的路径（增加 NPU 卡或换用 910C），同时优化 Skill 的 Prompt 工程降低模型负担。</w:t>
       </w:r>
     </w:p>
     <w:p>

</xml_diff>